<commit_message>
manuscript+report: fold in scale-invariant 2nd-domain replication (antidepressants)
Upgrades the earlier raw-HAM-D boundary to the fuller, stronger arc: raw MD fails (scale
artefact); scale-invariant z + response-logOR REPRODUCE (corr(kappa_z,1-lambda)=+0.64 over 3
classes; SSRI +0.69[+0.23,+1.29] & atypical +1.18[+0.73,+1.86] robustly positive; SSRI logOR
+0.47[+0.09,+1.14]; SNRI lowest-severity null -- severity-consistent). Manuscript gains a
'Second-domain replication' paragraph + revised limitation (i); honest caveats kept (2-3 classes,
class-corr suggestive not inferential, diabetes 7-class remains primary). docx rebuilt+validated.

Co-Authored-By: Claude Opus 4.8 (1M context) <noreply@anthropic.com>
</commit_message>
<xml_diff>
--- a/manuscript/Transport_NMA.docx
+++ b/manuscript/Transport_NMA.docx
@@ -7626,10 +7626,25 @@
           <w:b/>
           <w:bCs/>
         </w:rPr>
+        <w:t xml:space="preserve">Second-domain replication (antidepressants). </w:t>
+      </w:r>
+      <w:r>
+        <w:t xml:space="preserve">We tested endpoint-generalisation directly in Turner's own domain (major depression). Raw AACT HAM-D mean differences do not transfer — but this is a scale artefact, not a real boundary: raw HAM-D mixes 17/21/24-item versions, within- vs between-arm, and timepoints (41% have |MD| &lt; 0.5, implausible), so the ratio reflects scale heterogeneity. Re-run on scale-invariant measures the gap reproduces. On the standardised significance measure z = |MD|/SE (HAM-D + MADRS), corr(κ_z, 1−λ) = +0.64 over the three adequately-powered classes (diabetes reference +0.50), and trial-level bootstrap shows published trials have robustly larger standardised effects in the two best-powered classes (SSRI κ_z +0.69 [+0.23, +1.29]; atypical +1.18 [+0.73, +1.86]; both exclude 0), while the lowest-severity class SNRI is null (−0.33 [−0.55, +0.26]) — consistent with the severity-tracking model. On response/remission log-odds the SSRI gap is also robustly positive (+0.47 [+0.09, +1.14]). We do not over-claim: only 2–3 antidepressant classes carry adequate registered-only support, so the class-level correlation is suggestive, not inferential; the robust evidence is the per-class trial-level gaps. Diabetes (7 classes) remains the primary validation; antidepressants corroborate it in a second, independent domain.</w:t>
+      </w:r>
+    </w:p>
+    <w:p>
+      <w:pPr>
+        <w:spacing w:after="120" w:line="276"/>
+      </w:pPr>
+      <w:r>
+        <w:rPr>
+          <w:b/>
+          <w:bCs/>
+        </w:rPr>
         <w:t xml:space="preserve">Limitations. </w:t>
       </w:r>
       <w:r>
-        <w:t xml:space="preserve">(i) A single network and endpoint (diabetes, HbA1c); the external-magnitude construction is endpoint-matched, so generalisation requires re-estimating κ per endpoint family. We tested this directly by re-running the machinery in Turner's own antidepressant domain (major depression, HAM-D): the registered-versus-published gap does not cleanly transfer, because raw AACT HAM-D mean differences are heterogeneous (17/21/24-item versions, within- vs between-arm, multiple timepoints — 41% have |MD| &lt; 0.5 HAM-D points, an implausible treatment difference), so the ratio reflects scale heterogeneity rather than selection. The method therefore requires a single standardised endpoint like HbA1c; a rating-scale domain would need standardised effect sizes (Hedges's g), exactly what Turner (2008) used and AACT does not store. Honest boundary, not a refutation (sign remained positive, corr +0.35). (ii) The simulation uses the senn2013 geometry with an assumed multiplicative selection model; the oracle is an upper bound, not a claim about real senn2013 selection. (iii) λ and κ are drug-class properties from a single AACT snapshot; a live pipeline should re-freeze both per snapshot. (iv) The presence-gate limitation is intrinsic to sparse networks, not to this estimator.</w:t>
+        <w:t xml:space="preserve">(i) The external-magnitude construction is endpoint-matched, so generalisation requires re-estimating κ on a standardised effect scale per endpoint family (raw multi-version rating scales must first be reduced to z or a log-odds effect, as above). (ii) The simulation uses the senn2013 geometry with an assumed multiplicative selection model; the oracle is an upper bound, not a claim about real senn2013 selection. (iii) λ and κ are drug-class properties from a single AACT snapshot; a live pipeline should re-freeze both per snapshot. (iv) The presence-gate limitation is intrinsic to sparse networks, not to this estimator.</w:t>
       </w:r>
     </w:p>
     <w:p>

</xml_diff>

<commit_message>
transport-nma: add DEPLOYABLE external kappa=0.158 to the head-to-head (not just oracle)
Reviewer-proofing Table 3: the registry-lambda win over PET/trim-fill/Henmi-Copas previously used
an ORACLE kappa. Added the frozen deployable external kappa_pooled=0.158 (from the AACT
registered-vs-published gap, no oracle/funnel) as a scored method in h2h_bench.py with the same
baseline. Result: registry_ext0.158 MATCHES the oracle at B=0.15 (-0.119 vs -0.118 WINS) and WINS
at B=0.30 (-0.231), beating every internal funnel model; only cost is the documented B=0
over-correction (+0.053). Head-to-head advantage now holds for the method a user can actually run.
Manuscript Table 3 + text updated; docx rebuilt+validated; tests 4/4.

Co-Authored-By: Claude Opus 4.8 (1M context) <noreply@anthropic.com>
</commit_message>
<xml_diff>
--- a/manuscript/Transport_NMA.docx
+++ b/manuscript/Transport_NMA.docx
@@ -4940,7 +4940,7 @@
     </w:p>
     <w:tbl>
       <w:tblPr>
-        <w:tblW w:type="dxa" w:w="9380"/>
+        <w:tblW w:type="dxa" w:w="9360"/>
         <w:tblBorders>
           <w:top w:val="single" w:color="auto" w:sz="4"/>
           <w:left w:val="single" w:color="auto" w:sz="4"/>
@@ -4951,10 +4951,10 @@
         </w:tblBorders>
       </w:tblPr>
       <w:tblGrid>
-        <w:gridCol w:w="2600"/>
-        <w:gridCol w:w="2260"/>
-        <w:gridCol w:w="2260"/>
-        <w:gridCol w:w="2260"/>
+        <w:gridCol w:w="3200"/>
+        <w:gridCol w:w="2000"/>
+        <w:gridCol w:w="2080"/>
+        <w:gridCol w:w="2080"/>
       </w:tblGrid>
       <w:tr>
         <w:trPr>
@@ -4962,7 +4962,7 @@
         </w:trPr>
         <w:tc>
           <w:tcPr>
-            <w:tcW w:type="dxa" w:w="2600"/>
+            <w:tcW w:type="dxa" w:w="3200"/>
             <w:tcBorders>
               <w:top w:val="single" w:color="BBBBBB" w:sz="1"/>
               <w:left w:val="single" w:color="BBBBBB" w:sz="1"/>
@@ -4995,7 +4995,7 @@
         </w:tc>
         <w:tc>
           <w:tcPr>
-            <w:tcW w:type="dxa" w:w="2260"/>
+            <w:tcW w:type="dxa" w:w="2000"/>
             <w:tcBorders>
               <w:top w:val="single" w:color="BBBBBB" w:sz="1"/>
               <w:left w:val="single" w:color="BBBBBB" w:sz="1"/>
@@ -5028,7 +5028,7 @@
         </w:tc>
         <w:tc>
           <w:tcPr>
-            <w:tcW w:type="dxa" w:w="2260"/>
+            <w:tcW w:type="dxa" w:w="2080"/>
             <w:tcBorders>
               <w:top w:val="single" w:color="BBBBBB" w:sz="1"/>
               <w:left w:val="single" w:color="BBBBBB" w:sz="1"/>
@@ -5061,7 +5061,7 @@
         </w:tc>
         <w:tc>
           <w:tcPr>
-            <w:tcW w:type="dxa" w:w="2260"/>
+            <w:tcW w:type="dxa" w:w="2080"/>
             <w:tcBorders>
               <w:top w:val="single" w:color="BBBBBB" w:sz="1"/>
               <w:left w:val="single" w:color="BBBBBB" w:sz="1"/>
@@ -5096,7 +5096,7 @@
       <w:tr>
         <w:tc>
           <w:tcPr>
-            <w:tcW w:type="dxa" w:w="2600"/>
+            <w:tcW w:type="dxa" w:w="3200"/>
             <w:tcBorders>
               <w:top w:val="single" w:color="BBBBBB" w:sz="1"/>
               <w:left w:val="single" w:color="BBBBBB" w:sz="1"/>
@@ -5128,7 +5128,7 @@
         </w:tc>
         <w:tc>
           <w:tcPr>
-            <w:tcW w:type="dxa" w:w="2260"/>
+            <w:tcW w:type="dxa" w:w="2000"/>
             <w:tcBorders>
               <w:top w:val="single" w:color="BBBBBB" w:sz="1"/>
               <w:left w:val="single" w:color="BBBBBB" w:sz="1"/>
@@ -5160,7 +5160,7 @@
         </w:tc>
         <w:tc>
           <w:tcPr>
-            <w:tcW w:type="dxa" w:w="2260"/>
+            <w:tcW w:type="dxa" w:w="2080"/>
             <w:tcBorders>
               <w:top w:val="single" w:color="BBBBBB" w:sz="1"/>
               <w:left w:val="single" w:color="BBBBBB" w:sz="1"/>
@@ -5192,7 +5192,7 @@
         </w:tc>
         <w:tc>
           <w:tcPr>
-            <w:tcW w:type="dxa" w:w="2260"/>
+            <w:tcW w:type="dxa" w:w="2080"/>
             <w:tcBorders>
               <w:top w:val="single" w:color="BBBBBB" w:sz="1"/>
               <w:left w:val="single" w:color="BBBBBB" w:sz="1"/>
@@ -5226,129 +5226,129 @@
       <w:tr>
         <w:tc>
           <w:tcPr>
-            <w:tcW w:type="dxa" w:w="2600"/>
-            <w:tcBorders>
-              <w:top w:val="single" w:color="BBBBBB" w:sz="1"/>
-              <w:left w:val="single" w:color="BBBBBB" w:sz="1"/>
-              <w:bottom w:val="single" w:color="BBBBBB" w:sz="1"/>
-              <w:right w:val="single" w:color="BBBBBB" w:sz="1"/>
-            </w:tcBorders>
-            <w:tcMar>
-              <w:top w:type="dxa" w:w="60"/>
-              <w:left w:type="dxa" w:w="110"/>
-              <w:bottom w:type="dxa" w:w="60"/>
-              <w:right w:type="dxa" w:w="110"/>
-            </w:tcMar>
-            <w:vAlign w:val="center"/>
-          </w:tcPr>
-          <w:p>
-            <w:pPr>
-              <w:spacing w:after="0"/>
-            </w:pPr>
-            <w:r>
-              <w:rPr>
-                <w:b w:val="false"/>
-                <w:bCs w:val="false"/>
-                <w:sz w:val="16"/>
-                <w:szCs w:val="16"/>
-              </w:rPr>
-              <w:t xml:space="preserve">PET-PEESE</w:t>
-            </w:r>
-          </w:p>
-        </w:tc>
-        <w:tc>
-          <w:tcPr>
-            <w:tcW w:type="dxa" w:w="2260"/>
-            <w:tcBorders>
-              <w:top w:val="single" w:color="BBBBBB" w:sz="1"/>
-              <w:left w:val="single" w:color="BBBBBB" w:sz="1"/>
-              <w:bottom w:val="single" w:color="BBBBBB" w:sz="1"/>
-              <w:right w:val="single" w:color="BBBBBB" w:sz="1"/>
-            </w:tcBorders>
-            <w:tcMar>
-              <w:top w:type="dxa" w:w="60"/>
-              <w:left w:type="dxa" w:w="110"/>
-              <w:bottom w:type="dxa" w:w="60"/>
-              <w:right w:type="dxa" w:w="110"/>
-            </w:tcMar>
-            <w:vAlign w:val="center"/>
-          </w:tcPr>
-          <w:p>
-            <w:pPr>
-              <w:spacing w:after="0"/>
-            </w:pPr>
-            <w:r>
-              <w:rPr>
-                <w:b w:val="false"/>
-                <w:bCs w:val="false"/>
-                <w:sz w:val="16"/>
-                <w:szCs w:val="16"/>
-              </w:rPr>
-              <w:t xml:space="preserve">+0.680 (HARMS)</w:t>
-            </w:r>
-          </w:p>
-        </w:tc>
-        <w:tc>
-          <w:tcPr>
-            <w:tcW w:type="dxa" w:w="2260"/>
-            <w:tcBorders>
-              <w:top w:val="single" w:color="BBBBBB" w:sz="1"/>
-              <w:left w:val="single" w:color="BBBBBB" w:sz="1"/>
-              <w:bottom w:val="single" w:color="BBBBBB" w:sz="1"/>
-              <w:right w:val="single" w:color="BBBBBB" w:sz="1"/>
-            </w:tcBorders>
-            <w:tcMar>
-              <w:top w:type="dxa" w:w="60"/>
-              <w:left w:type="dxa" w:w="110"/>
-              <w:bottom w:type="dxa" w:w="60"/>
-              <w:right w:type="dxa" w:w="110"/>
-            </w:tcMar>
-            <w:vAlign w:val="center"/>
-          </w:tcPr>
-          <w:p>
-            <w:pPr>
-              <w:spacing w:after="0"/>
-            </w:pPr>
-            <w:r>
-              <w:rPr>
-                <w:b w:val="false"/>
-                <w:bCs w:val="false"/>
-                <w:sz w:val="16"/>
-                <w:szCs w:val="16"/>
-              </w:rPr>
-              <w:t xml:space="preserve">+0.641 (HARMS)</w:t>
-            </w:r>
-          </w:p>
-        </w:tc>
-        <w:tc>
-          <w:tcPr>
-            <w:tcW w:type="dxa" w:w="2260"/>
-            <w:tcBorders>
-              <w:top w:val="single" w:color="BBBBBB" w:sz="1"/>
-              <w:left w:val="single" w:color="BBBBBB" w:sz="1"/>
-              <w:bottom w:val="single" w:color="BBBBBB" w:sz="1"/>
-              <w:right w:val="single" w:color="BBBBBB" w:sz="1"/>
-            </w:tcBorders>
-            <w:tcMar>
-              <w:top w:type="dxa" w:w="60"/>
-              <w:left w:type="dxa" w:w="110"/>
-              <w:bottom w:type="dxa" w:w="60"/>
-              <w:right w:type="dxa" w:w="110"/>
-            </w:tcMar>
-            <w:vAlign w:val="center"/>
-          </w:tcPr>
-          <w:p>
-            <w:pPr>
-              <w:spacing w:after="0"/>
-            </w:pPr>
-            <w:r>
-              <w:rPr>
-                <w:b w:val="false"/>
-                <w:bCs w:val="false"/>
-                <w:sz w:val="16"/>
-                <w:szCs w:val="16"/>
-              </w:rPr>
-              <w:t xml:space="preserve">+0.577 (HARMS)</w:t>
+            <w:tcW w:type="dxa" w:w="3200"/>
+            <w:tcBorders>
+              <w:top w:val="single" w:color="BBBBBB" w:sz="1"/>
+              <w:left w:val="single" w:color="BBBBBB" w:sz="1"/>
+              <w:bottom w:val="single" w:color="BBBBBB" w:sz="1"/>
+              <w:right w:val="single" w:color="BBBBBB" w:sz="1"/>
+            </w:tcBorders>
+            <w:tcMar>
+              <w:top w:type="dxa" w:w="60"/>
+              <w:left w:type="dxa" w:w="110"/>
+              <w:bottom w:type="dxa" w:w="60"/>
+              <w:right w:type="dxa" w:w="110"/>
+            </w:tcMar>
+            <w:vAlign w:val="center"/>
+          </w:tcPr>
+          <w:p>
+            <w:pPr>
+              <w:spacing w:after="0"/>
+            </w:pPr>
+            <w:r>
+              <w:rPr>
+                <w:b/>
+                <w:bCs/>
+                <w:sz w:val="16"/>
+                <w:szCs w:val="16"/>
+              </w:rPr>
+              <w:t xml:space="preserve">registry-λ (external κ=0.158, deployable)</w:t>
+            </w:r>
+          </w:p>
+        </w:tc>
+        <w:tc>
+          <w:tcPr>
+            <w:tcW w:type="dxa" w:w="2000"/>
+            <w:tcBorders>
+              <w:top w:val="single" w:color="BBBBBB" w:sz="1"/>
+              <w:left w:val="single" w:color="BBBBBB" w:sz="1"/>
+              <w:bottom w:val="single" w:color="BBBBBB" w:sz="1"/>
+              <w:right w:val="single" w:color="BBBBBB" w:sz="1"/>
+            </w:tcBorders>
+            <w:tcMar>
+              <w:top w:type="dxa" w:w="60"/>
+              <w:left w:type="dxa" w:w="110"/>
+              <w:bottom w:type="dxa" w:w="60"/>
+              <w:right w:type="dxa" w:w="110"/>
+            </w:tcMar>
+            <w:vAlign w:val="center"/>
+          </w:tcPr>
+          <w:p>
+            <w:pPr>
+              <w:spacing w:after="0"/>
+            </w:pPr>
+            <w:r>
+              <w:rPr>
+                <w:b w:val="false"/>
+                <w:bCs w:val="false"/>
+                <w:sz w:val="16"/>
+                <w:szCs w:val="16"/>
+              </w:rPr>
+              <w:t xml:space="preserve">+0.053 (HARMS)</w:t>
+            </w:r>
+          </w:p>
+        </w:tc>
+        <w:tc>
+          <w:tcPr>
+            <w:tcW w:type="dxa" w:w="2080"/>
+            <w:tcBorders>
+              <w:top w:val="single" w:color="BBBBBB" w:sz="1"/>
+              <w:left w:val="single" w:color="BBBBBB" w:sz="1"/>
+              <w:bottom w:val="single" w:color="BBBBBB" w:sz="1"/>
+              <w:right w:val="single" w:color="BBBBBB" w:sz="1"/>
+            </w:tcBorders>
+            <w:tcMar>
+              <w:top w:type="dxa" w:w="60"/>
+              <w:left w:type="dxa" w:w="110"/>
+              <w:bottom w:type="dxa" w:w="60"/>
+              <w:right w:type="dxa" w:w="110"/>
+            </w:tcMar>
+            <w:vAlign w:val="center"/>
+          </w:tcPr>
+          <w:p>
+            <w:pPr>
+              <w:spacing w:after="0"/>
+            </w:pPr>
+            <w:r>
+              <w:rPr>
+                <w:b/>
+                <w:bCs/>
+                <w:sz w:val="16"/>
+                <w:szCs w:val="16"/>
+              </w:rPr>
+              <w:t xml:space="preserve">−0.119 (WINS)</w:t>
+            </w:r>
+          </w:p>
+        </w:tc>
+        <w:tc>
+          <w:tcPr>
+            <w:tcW w:type="dxa" w:w="2080"/>
+            <w:tcBorders>
+              <w:top w:val="single" w:color="BBBBBB" w:sz="1"/>
+              <w:left w:val="single" w:color="BBBBBB" w:sz="1"/>
+              <w:bottom w:val="single" w:color="BBBBBB" w:sz="1"/>
+              <w:right w:val="single" w:color="BBBBBB" w:sz="1"/>
+            </w:tcBorders>
+            <w:tcMar>
+              <w:top w:type="dxa" w:w="60"/>
+              <w:left w:type="dxa" w:w="110"/>
+              <w:bottom w:type="dxa" w:w="60"/>
+              <w:right w:type="dxa" w:w="110"/>
+            </w:tcMar>
+            <w:vAlign w:val="center"/>
+          </w:tcPr>
+          <w:p>
+            <w:pPr>
+              <w:spacing w:after="0"/>
+            </w:pPr>
+            <w:r>
+              <w:rPr>
+                <w:b/>
+                <w:bCs/>
+                <w:sz w:val="16"/>
+                <w:szCs w:val="16"/>
+              </w:rPr>
+              <w:t xml:space="preserve">−0.231 (WINS)</w:t>
             </w:r>
           </w:p>
         </w:tc>
@@ -5356,129 +5356,129 @@
       <w:tr>
         <w:tc>
           <w:tcPr>
-            <w:tcW w:type="dxa" w:w="2600"/>
-            <w:tcBorders>
-              <w:top w:val="single" w:color="BBBBBB" w:sz="1"/>
-              <w:left w:val="single" w:color="BBBBBB" w:sz="1"/>
-              <w:bottom w:val="single" w:color="BBBBBB" w:sz="1"/>
-              <w:right w:val="single" w:color="BBBBBB" w:sz="1"/>
-            </w:tcBorders>
-            <w:tcMar>
-              <w:top w:type="dxa" w:w="60"/>
-              <w:left w:type="dxa" w:w="110"/>
-              <w:bottom w:type="dxa" w:w="60"/>
-              <w:right w:type="dxa" w:w="110"/>
-            </w:tcMar>
-            <w:vAlign w:val="center"/>
-          </w:tcPr>
-          <w:p>
-            <w:pPr>
-              <w:spacing w:after="0"/>
-            </w:pPr>
-            <w:r>
-              <w:rPr>
-                <w:b w:val="false"/>
-                <w:bCs w:val="false"/>
-                <w:sz w:val="16"/>
-                <w:szCs w:val="16"/>
-              </w:rPr>
-              <w:t xml:space="preserve">trim-and-fill</w:t>
-            </w:r>
-          </w:p>
-        </w:tc>
-        <w:tc>
-          <w:tcPr>
-            <w:tcW w:type="dxa" w:w="2260"/>
-            <w:tcBorders>
-              <w:top w:val="single" w:color="BBBBBB" w:sz="1"/>
-              <w:left w:val="single" w:color="BBBBBB" w:sz="1"/>
-              <w:bottom w:val="single" w:color="BBBBBB" w:sz="1"/>
-              <w:right w:val="single" w:color="BBBBBB" w:sz="1"/>
-            </w:tcBorders>
-            <w:tcMar>
-              <w:top w:type="dxa" w:w="60"/>
-              <w:left w:type="dxa" w:w="110"/>
-              <w:bottom w:type="dxa" w:w="60"/>
-              <w:right w:type="dxa" w:w="110"/>
-            </w:tcMar>
-            <w:vAlign w:val="center"/>
-          </w:tcPr>
-          <w:p>
-            <w:pPr>
-              <w:spacing w:after="0"/>
-            </w:pPr>
-            <w:r>
-              <w:rPr>
-                <w:b w:val="false"/>
-                <w:bCs w:val="false"/>
-                <w:sz w:val="16"/>
-                <w:szCs w:val="16"/>
-              </w:rPr>
-              <w:t xml:space="preserve">+0.035 (HARMS)</w:t>
-            </w:r>
-          </w:p>
-        </w:tc>
-        <w:tc>
-          <w:tcPr>
-            <w:tcW w:type="dxa" w:w="2260"/>
-            <w:tcBorders>
-              <w:top w:val="single" w:color="BBBBBB" w:sz="1"/>
-              <w:left w:val="single" w:color="BBBBBB" w:sz="1"/>
-              <w:bottom w:val="single" w:color="BBBBBB" w:sz="1"/>
-              <w:right w:val="single" w:color="BBBBBB" w:sz="1"/>
-            </w:tcBorders>
-            <w:tcMar>
-              <w:top w:type="dxa" w:w="60"/>
-              <w:left w:type="dxa" w:w="110"/>
-              <w:bottom w:type="dxa" w:w="60"/>
-              <w:right w:type="dxa" w:w="110"/>
-            </w:tcMar>
-            <w:vAlign w:val="center"/>
-          </w:tcPr>
-          <w:p>
-            <w:pPr>
-              <w:spacing w:after="0"/>
-            </w:pPr>
-            <w:r>
-              <w:rPr>
-                <w:b w:val="false"/>
-                <w:bCs w:val="false"/>
-                <w:sz w:val="16"/>
-                <w:szCs w:val="16"/>
-              </w:rPr>
-              <w:t xml:space="preserve">+0.021 (HARMS)</w:t>
-            </w:r>
-          </w:p>
-        </w:tc>
-        <w:tc>
-          <w:tcPr>
-            <w:tcW w:type="dxa" w:w="2260"/>
-            <w:tcBorders>
-              <w:top w:val="single" w:color="BBBBBB" w:sz="1"/>
-              <w:left w:val="single" w:color="BBBBBB" w:sz="1"/>
-              <w:bottom w:val="single" w:color="BBBBBB" w:sz="1"/>
-              <w:right w:val="single" w:color="BBBBBB" w:sz="1"/>
-            </w:tcBorders>
-            <w:tcMar>
-              <w:top w:type="dxa" w:w="60"/>
-              <w:left w:type="dxa" w:w="110"/>
-              <w:bottom w:type="dxa" w:w="60"/>
-              <w:right w:type="dxa" w:w="110"/>
-            </w:tcMar>
-            <w:vAlign w:val="center"/>
-          </w:tcPr>
-          <w:p>
-            <w:pPr>
-              <w:spacing w:after="0"/>
-            </w:pPr>
-            <w:r>
-              <w:rPr>
-                <w:b w:val="false"/>
-                <w:bCs w:val="false"/>
-                <w:sz w:val="16"/>
-                <w:szCs w:val="16"/>
-              </w:rPr>
-              <w:t xml:space="preserve">+0.024 (HARMS)</w:t>
+            <w:tcW w:type="dxa" w:w="3200"/>
+            <w:tcBorders>
+              <w:top w:val="single" w:color="BBBBBB" w:sz="1"/>
+              <w:left w:val="single" w:color="BBBBBB" w:sz="1"/>
+              <w:bottom w:val="single" w:color="BBBBBB" w:sz="1"/>
+              <w:right w:val="single" w:color="BBBBBB" w:sz="1"/>
+            </w:tcBorders>
+            <w:tcMar>
+              <w:top w:type="dxa" w:w="60"/>
+              <w:left w:type="dxa" w:w="110"/>
+              <w:bottom w:type="dxa" w:w="60"/>
+              <w:right w:type="dxa" w:w="110"/>
+            </w:tcMar>
+            <w:vAlign w:val="center"/>
+          </w:tcPr>
+          <w:p>
+            <w:pPr>
+              <w:spacing w:after="0"/>
+            </w:pPr>
+            <w:r>
+              <w:rPr>
+                <w:b w:val="false"/>
+                <w:bCs w:val="false"/>
+                <w:sz w:val="16"/>
+                <w:szCs w:val="16"/>
+              </w:rPr>
+              <w:t xml:space="preserve">PET-PEESE</w:t>
+            </w:r>
+          </w:p>
+        </w:tc>
+        <w:tc>
+          <w:tcPr>
+            <w:tcW w:type="dxa" w:w="2000"/>
+            <w:tcBorders>
+              <w:top w:val="single" w:color="BBBBBB" w:sz="1"/>
+              <w:left w:val="single" w:color="BBBBBB" w:sz="1"/>
+              <w:bottom w:val="single" w:color="BBBBBB" w:sz="1"/>
+              <w:right w:val="single" w:color="BBBBBB" w:sz="1"/>
+            </w:tcBorders>
+            <w:tcMar>
+              <w:top w:type="dxa" w:w="60"/>
+              <w:left w:type="dxa" w:w="110"/>
+              <w:bottom w:type="dxa" w:w="60"/>
+              <w:right w:type="dxa" w:w="110"/>
+            </w:tcMar>
+            <w:vAlign w:val="center"/>
+          </w:tcPr>
+          <w:p>
+            <w:pPr>
+              <w:spacing w:after="0"/>
+            </w:pPr>
+            <w:r>
+              <w:rPr>
+                <w:b w:val="false"/>
+                <w:bCs w:val="false"/>
+                <w:sz w:val="16"/>
+                <w:szCs w:val="16"/>
+              </w:rPr>
+              <w:t xml:space="preserve">+0.680 (HARMS)</w:t>
+            </w:r>
+          </w:p>
+        </w:tc>
+        <w:tc>
+          <w:tcPr>
+            <w:tcW w:type="dxa" w:w="2080"/>
+            <w:tcBorders>
+              <w:top w:val="single" w:color="BBBBBB" w:sz="1"/>
+              <w:left w:val="single" w:color="BBBBBB" w:sz="1"/>
+              <w:bottom w:val="single" w:color="BBBBBB" w:sz="1"/>
+              <w:right w:val="single" w:color="BBBBBB" w:sz="1"/>
+            </w:tcBorders>
+            <w:tcMar>
+              <w:top w:type="dxa" w:w="60"/>
+              <w:left w:type="dxa" w:w="110"/>
+              <w:bottom w:type="dxa" w:w="60"/>
+              <w:right w:type="dxa" w:w="110"/>
+            </w:tcMar>
+            <w:vAlign w:val="center"/>
+          </w:tcPr>
+          <w:p>
+            <w:pPr>
+              <w:spacing w:after="0"/>
+            </w:pPr>
+            <w:r>
+              <w:rPr>
+                <w:b w:val="false"/>
+                <w:bCs w:val="false"/>
+                <w:sz w:val="16"/>
+                <w:szCs w:val="16"/>
+              </w:rPr>
+              <w:t xml:space="preserve">+0.641 (HARMS)</w:t>
+            </w:r>
+          </w:p>
+        </w:tc>
+        <w:tc>
+          <w:tcPr>
+            <w:tcW w:type="dxa" w:w="2080"/>
+            <w:tcBorders>
+              <w:top w:val="single" w:color="BBBBBB" w:sz="1"/>
+              <w:left w:val="single" w:color="BBBBBB" w:sz="1"/>
+              <w:bottom w:val="single" w:color="BBBBBB" w:sz="1"/>
+              <w:right w:val="single" w:color="BBBBBB" w:sz="1"/>
+            </w:tcBorders>
+            <w:tcMar>
+              <w:top w:type="dxa" w:w="60"/>
+              <w:left w:type="dxa" w:w="110"/>
+              <w:bottom w:type="dxa" w:w="60"/>
+              <w:right w:type="dxa" w:w="110"/>
+            </w:tcMar>
+            <w:vAlign w:val="center"/>
+          </w:tcPr>
+          <w:p>
+            <w:pPr>
+              <w:spacing w:after="0"/>
+            </w:pPr>
+            <w:r>
+              <w:rPr>
+                <w:b w:val="false"/>
+                <w:bCs w:val="false"/>
+                <w:sz w:val="16"/>
+                <w:szCs w:val="16"/>
+              </w:rPr>
+              <w:t xml:space="preserve">+0.577 (HARMS)</w:t>
             </w:r>
           </w:p>
         </w:tc>
@@ -5486,129 +5486,129 @@
       <w:tr>
         <w:tc>
           <w:tcPr>
-            <w:tcW w:type="dxa" w:w="2600"/>
-            <w:tcBorders>
-              <w:top w:val="single" w:color="BBBBBB" w:sz="1"/>
-              <w:left w:val="single" w:color="BBBBBB" w:sz="1"/>
-              <w:bottom w:val="single" w:color="BBBBBB" w:sz="1"/>
-              <w:right w:val="single" w:color="BBBBBB" w:sz="1"/>
-            </w:tcBorders>
-            <w:tcMar>
-              <w:top w:type="dxa" w:w="60"/>
-              <w:left w:type="dxa" w:w="110"/>
-              <w:bottom w:type="dxa" w:w="60"/>
-              <w:right w:type="dxa" w:w="110"/>
-            </w:tcMar>
-            <w:vAlign w:val="center"/>
-          </w:tcPr>
-          <w:p>
-            <w:pPr>
-              <w:spacing w:after="0"/>
-            </w:pPr>
-            <w:r>
-              <w:rPr>
-                <w:b w:val="false"/>
-                <w:bCs w:val="false"/>
-                <w:sz w:val="16"/>
-                <w:szCs w:val="16"/>
-              </w:rPr>
-              <w:t xml:space="preserve">Henmi–Copas</w:t>
-            </w:r>
-          </w:p>
-        </w:tc>
-        <w:tc>
-          <w:tcPr>
-            <w:tcW w:type="dxa" w:w="2260"/>
-            <w:tcBorders>
-              <w:top w:val="single" w:color="BBBBBB" w:sz="1"/>
-              <w:left w:val="single" w:color="BBBBBB" w:sz="1"/>
-              <w:bottom w:val="single" w:color="BBBBBB" w:sz="1"/>
-              <w:right w:val="single" w:color="BBBBBB" w:sz="1"/>
-            </w:tcBorders>
-            <w:tcMar>
-              <w:top w:type="dxa" w:w="60"/>
-              <w:left w:type="dxa" w:w="110"/>
-              <w:bottom w:type="dxa" w:w="60"/>
-              <w:right w:type="dxa" w:w="110"/>
-            </w:tcMar>
-            <w:vAlign w:val="center"/>
-          </w:tcPr>
-          <w:p>
-            <w:pPr>
-              <w:spacing w:after="0"/>
-            </w:pPr>
-            <w:r>
-              <w:rPr>
-                <w:b w:val="false"/>
-                <w:bCs w:val="false"/>
-                <w:sz w:val="16"/>
-                <w:szCs w:val="16"/>
-              </w:rPr>
-              <w:t xml:space="preserve">+0.020 (HARMS)</w:t>
-            </w:r>
-          </w:p>
-        </w:tc>
-        <w:tc>
-          <w:tcPr>
-            <w:tcW w:type="dxa" w:w="2260"/>
-            <w:tcBorders>
-              <w:top w:val="single" w:color="BBBBBB" w:sz="1"/>
-              <w:left w:val="single" w:color="BBBBBB" w:sz="1"/>
-              <w:bottom w:val="single" w:color="BBBBBB" w:sz="1"/>
-              <w:right w:val="single" w:color="BBBBBB" w:sz="1"/>
-            </w:tcBorders>
-            <w:tcMar>
-              <w:top w:type="dxa" w:w="60"/>
-              <w:left w:type="dxa" w:w="110"/>
-              <w:bottom w:type="dxa" w:w="60"/>
-              <w:right w:type="dxa" w:w="110"/>
-            </w:tcMar>
-            <w:vAlign w:val="center"/>
-          </w:tcPr>
-          <w:p>
-            <w:pPr>
-              <w:spacing w:after="0"/>
-            </w:pPr>
-            <w:r>
-              <w:rPr>
-                <w:b w:val="false"/>
-                <w:bCs w:val="false"/>
-                <w:sz w:val="16"/>
-                <w:szCs w:val="16"/>
-              </w:rPr>
-              <w:t xml:space="preserve">+0.002 (tie)</w:t>
-            </w:r>
-          </w:p>
-        </w:tc>
-        <w:tc>
-          <w:tcPr>
-            <w:tcW w:type="dxa" w:w="2260"/>
-            <w:tcBorders>
-              <w:top w:val="single" w:color="BBBBBB" w:sz="1"/>
-              <w:left w:val="single" w:color="BBBBBB" w:sz="1"/>
-              <w:bottom w:val="single" w:color="BBBBBB" w:sz="1"/>
-              <w:right w:val="single" w:color="BBBBBB" w:sz="1"/>
-            </w:tcBorders>
-            <w:tcMar>
-              <w:top w:type="dxa" w:w="60"/>
-              <w:left w:type="dxa" w:w="110"/>
-              <w:bottom w:type="dxa" w:w="60"/>
-              <w:right w:type="dxa" w:w="110"/>
-            </w:tcMar>
-            <w:vAlign w:val="center"/>
-          </w:tcPr>
-          <w:p>
-            <w:pPr>
-              <w:spacing w:after="0"/>
-            </w:pPr>
-            <w:r>
-              <w:rPr>
-                <w:b w:val="false"/>
-                <w:bCs w:val="false"/>
-                <w:sz w:val="16"/>
-                <w:szCs w:val="16"/>
-              </w:rPr>
-              <w:t xml:space="preserve">−0.004 (tie)</w:t>
+            <w:tcW w:type="dxa" w:w="3200"/>
+            <w:tcBorders>
+              <w:top w:val="single" w:color="BBBBBB" w:sz="1"/>
+              <w:left w:val="single" w:color="BBBBBB" w:sz="1"/>
+              <w:bottom w:val="single" w:color="BBBBBB" w:sz="1"/>
+              <w:right w:val="single" w:color="BBBBBB" w:sz="1"/>
+            </w:tcBorders>
+            <w:tcMar>
+              <w:top w:type="dxa" w:w="60"/>
+              <w:left w:type="dxa" w:w="110"/>
+              <w:bottom w:type="dxa" w:w="60"/>
+              <w:right w:type="dxa" w:w="110"/>
+            </w:tcMar>
+            <w:vAlign w:val="center"/>
+          </w:tcPr>
+          <w:p>
+            <w:pPr>
+              <w:spacing w:after="0"/>
+            </w:pPr>
+            <w:r>
+              <w:rPr>
+                <w:b w:val="false"/>
+                <w:bCs w:val="false"/>
+                <w:sz w:val="16"/>
+                <w:szCs w:val="16"/>
+              </w:rPr>
+              <w:t xml:space="preserve">trim-and-fill</w:t>
+            </w:r>
+          </w:p>
+        </w:tc>
+        <w:tc>
+          <w:tcPr>
+            <w:tcW w:type="dxa" w:w="2000"/>
+            <w:tcBorders>
+              <w:top w:val="single" w:color="BBBBBB" w:sz="1"/>
+              <w:left w:val="single" w:color="BBBBBB" w:sz="1"/>
+              <w:bottom w:val="single" w:color="BBBBBB" w:sz="1"/>
+              <w:right w:val="single" w:color="BBBBBB" w:sz="1"/>
+            </w:tcBorders>
+            <w:tcMar>
+              <w:top w:type="dxa" w:w="60"/>
+              <w:left w:type="dxa" w:w="110"/>
+              <w:bottom w:type="dxa" w:w="60"/>
+              <w:right w:type="dxa" w:w="110"/>
+            </w:tcMar>
+            <w:vAlign w:val="center"/>
+          </w:tcPr>
+          <w:p>
+            <w:pPr>
+              <w:spacing w:after="0"/>
+            </w:pPr>
+            <w:r>
+              <w:rPr>
+                <w:b w:val="false"/>
+                <w:bCs w:val="false"/>
+                <w:sz w:val="16"/>
+                <w:szCs w:val="16"/>
+              </w:rPr>
+              <w:t xml:space="preserve">+0.035 (HARMS)</w:t>
+            </w:r>
+          </w:p>
+        </w:tc>
+        <w:tc>
+          <w:tcPr>
+            <w:tcW w:type="dxa" w:w="2080"/>
+            <w:tcBorders>
+              <w:top w:val="single" w:color="BBBBBB" w:sz="1"/>
+              <w:left w:val="single" w:color="BBBBBB" w:sz="1"/>
+              <w:bottom w:val="single" w:color="BBBBBB" w:sz="1"/>
+              <w:right w:val="single" w:color="BBBBBB" w:sz="1"/>
+            </w:tcBorders>
+            <w:tcMar>
+              <w:top w:type="dxa" w:w="60"/>
+              <w:left w:type="dxa" w:w="110"/>
+              <w:bottom w:type="dxa" w:w="60"/>
+              <w:right w:type="dxa" w:w="110"/>
+            </w:tcMar>
+            <w:vAlign w:val="center"/>
+          </w:tcPr>
+          <w:p>
+            <w:pPr>
+              <w:spacing w:after="0"/>
+            </w:pPr>
+            <w:r>
+              <w:rPr>
+                <w:b w:val="false"/>
+                <w:bCs w:val="false"/>
+                <w:sz w:val="16"/>
+                <w:szCs w:val="16"/>
+              </w:rPr>
+              <w:t xml:space="preserve">+0.021 (HARMS)</w:t>
+            </w:r>
+          </w:p>
+        </w:tc>
+        <w:tc>
+          <w:tcPr>
+            <w:tcW w:type="dxa" w:w="2080"/>
+            <w:tcBorders>
+              <w:top w:val="single" w:color="BBBBBB" w:sz="1"/>
+              <w:left w:val="single" w:color="BBBBBB" w:sz="1"/>
+              <w:bottom w:val="single" w:color="BBBBBB" w:sz="1"/>
+              <w:right w:val="single" w:color="BBBBBB" w:sz="1"/>
+            </w:tcBorders>
+            <w:tcMar>
+              <w:top w:type="dxa" w:w="60"/>
+              <w:left w:type="dxa" w:w="110"/>
+              <w:bottom w:type="dxa" w:w="60"/>
+              <w:right w:type="dxa" w:w="110"/>
+            </w:tcMar>
+            <w:vAlign w:val="center"/>
+          </w:tcPr>
+          <w:p>
+            <w:pPr>
+              <w:spacing w:after="0"/>
+            </w:pPr>
+            <w:r>
+              <w:rPr>
+                <w:b w:val="false"/>
+                <w:bCs w:val="false"/>
+                <w:sz w:val="16"/>
+                <w:szCs w:val="16"/>
+              </w:rPr>
+              <w:t xml:space="preserve">+0.024 (HARMS)</w:t>
             </w:r>
           </w:p>
         </w:tc>
@@ -5616,7 +5616,137 @@
       <w:tr>
         <w:tc>
           <w:tcPr>
-            <w:tcW w:type="dxa" w:w="2600"/>
+            <w:tcW w:type="dxa" w:w="3200"/>
+            <w:tcBorders>
+              <w:top w:val="single" w:color="BBBBBB" w:sz="1"/>
+              <w:left w:val="single" w:color="BBBBBB" w:sz="1"/>
+              <w:bottom w:val="single" w:color="BBBBBB" w:sz="1"/>
+              <w:right w:val="single" w:color="BBBBBB" w:sz="1"/>
+            </w:tcBorders>
+            <w:tcMar>
+              <w:top w:type="dxa" w:w="60"/>
+              <w:left w:type="dxa" w:w="110"/>
+              <w:bottom w:type="dxa" w:w="60"/>
+              <w:right w:type="dxa" w:w="110"/>
+            </w:tcMar>
+            <w:vAlign w:val="center"/>
+          </w:tcPr>
+          <w:p>
+            <w:pPr>
+              <w:spacing w:after="0"/>
+            </w:pPr>
+            <w:r>
+              <w:rPr>
+                <w:b w:val="false"/>
+                <w:bCs w:val="false"/>
+                <w:sz w:val="16"/>
+                <w:szCs w:val="16"/>
+              </w:rPr>
+              <w:t xml:space="preserve">Henmi–Copas</w:t>
+            </w:r>
+          </w:p>
+        </w:tc>
+        <w:tc>
+          <w:tcPr>
+            <w:tcW w:type="dxa" w:w="2000"/>
+            <w:tcBorders>
+              <w:top w:val="single" w:color="BBBBBB" w:sz="1"/>
+              <w:left w:val="single" w:color="BBBBBB" w:sz="1"/>
+              <w:bottom w:val="single" w:color="BBBBBB" w:sz="1"/>
+              <w:right w:val="single" w:color="BBBBBB" w:sz="1"/>
+            </w:tcBorders>
+            <w:tcMar>
+              <w:top w:type="dxa" w:w="60"/>
+              <w:left w:type="dxa" w:w="110"/>
+              <w:bottom w:type="dxa" w:w="60"/>
+              <w:right w:type="dxa" w:w="110"/>
+            </w:tcMar>
+            <w:vAlign w:val="center"/>
+          </w:tcPr>
+          <w:p>
+            <w:pPr>
+              <w:spacing w:after="0"/>
+            </w:pPr>
+            <w:r>
+              <w:rPr>
+                <w:b w:val="false"/>
+                <w:bCs w:val="false"/>
+                <w:sz w:val="16"/>
+                <w:szCs w:val="16"/>
+              </w:rPr>
+              <w:t xml:space="preserve">+0.020 (HARMS)</w:t>
+            </w:r>
+          </w:p>
+        </w:tc>
+        <w:tc>
+          <w:tcPr>
+            <w:tcW w:type="dxa" w:w="2080"/>
+            <w:tcBorders>
+              <w:top w:val="single" w:color="BBBBBB" w:sz="1"/>
+              <w:left w:val="single" w:color="BBBBBB" w:sz="1"/>
+              <w:bottom w:val="single" w:color="BBBBBB" w:sz="1"/>
+              <w:right w:val="single" w:color="BBBBBB" w:sz="1"/>
+            </w:tcBorders>
+            <w:tcMar>
+              <w:top w:type="dxa" w:w="60"/>
+              <w:left w:type="dxa" w:w="110"/>
+              <w:bottom w:type="dxa" w:w="60"/>
+              <w:right w:type="dxa" w:w="110"/>
+            </w:tcMar>
+            <w:vAlign w:val="center"/>
+          </w:tcPr>
+          <w:p>
+            <w:pPr>
+              <w:spacing w:after="0"/>
+            </w:pPr>
+            <w:r>
+              <w:rPr>
+                <w:b w:val="false"/>
+                <w:bCs w:val="false"/>
+                <w:sz w:val="16"/>
+                <w:szCs w:val="16"/>
+              </w:rPr>
+              <w:t xml:space="preserve">+0.002 (tie)</w:t>
+            </w:r>
+          </w:p>
+        </w:tc>
+        <w:tc>
+          <w:tcPr>
+            <w:tcW w:type="dxa" w:w="2080"/>
+            <w:tcBorders>
+              <w:top w:val="single" w:color="BBBBBB" w:sz="1"/>
+              <w:left w:val="single" w:color="BBBBBB" w:sz="1"/>
+              <w:bottom w:val="single" w:color="BBBBBB" w:sz="1"/>
+              <w:right w:val="single" w:color="BBBBBB" w:sz="1"/>
+            </w:tcBorders>
+            <w:tcMar>
+              <w:top w:type="dxa" w:w="60"/>
+              <w:left w:type="dxa" w:w="110"/>
+              <w:bottom w:type="dxa" w:w="60"/>
+              <w:right w:type="dxa" w:w="110"/>
+            </w:tcMar>
+            <w:vAlign w:val="center"/>
+          </w:tcPr>
+          <w:p>
+            <w:pPr>
+              <w:spacing w:after="0"/>
+            </w:pPr>
+            <w:r>
+              <w:rPr>
+                <w:b w:val="false"/>
+                <w:bCs w:val="false"/>
+                <w:sz w:val="16"/>
+                <w:szCs w:val="16"/>
+              </w:rPr>
+              <w:t xml:space="preserve">−0.004 (tie)</w:t>
+            </w:r>
+          </w:p>
+        </w:tc>
+      </w:tr>
+      <w:tr>
+        <w:tc>
+          <w:tcPr>
+            <w:tcW w:type="dxa" w:w="3200"/>
             <w:tcBorders>
               <w:top w:val="single" w:color="BBBBBB" w:sz="1"/>
               <w:left w:val="single" w:color="BBBBBB" w:sz="1"/>
@@ -5648,7 +5778,7 @@
         </w:tc>
         <w:tc>
           <w:tcPr>
-            <w:tcW w:type="dxa" w:w="2260"/>
+            <w:tcW w:type="dxa" w:w="2000"/>
             <w:tcBorders>
               <w:top w:val="single" w:color="BBBBBB" w:sz="1"/>
               <w:left w:val="single" w:color="BBBBBB" w:sz="1"/>
@@ -5680,7 +5810,7 @@
         </w:tc>
         <w:tc>
           <w:tcPr>
-            <w:tcW w:type="dxa" w:w="2260"/>
+            <w:tcW w:type="dxa" w:w="2080"/>
             <w:tcBorders>
               <w:top w:val="single" w:color="BBBBBB" w:sz="1"/>
               <w:left w:val="single" w:color="BBBBBB" w:sz="1"/>
@@ -5712,7 +5842,7 @@
         </w:tc>
         <w:tc>
           <w:tcPr>
-            <w:tcW w:type="dxa" w:w="2260"/>
+            <w:tcW w:type="dxa" w:w="2080"/>
             <w:tcBorders>
               <w:top w:val="single" w:color="BBBBBB" w:sz="1"/>
               <w:left w:val="single" w:color="BBBBBB" w:sz="1"/>
@@ -5744,6 +5874,18 @@
         </w:tc>
       </w:tr>
     </w:tbl>
+    <w:p>
+      <w:pPr>
+        <w:spacing w:after="60" w:line="276"/>
+      </w:pPr>
+      <w:r>
+        <w:rPr>
+          <w:sz w:val="18"/>
+          <w:szCs w:val="18"/>
+        </w:rPr>
+        <w:t xml:space="preserve">The deployable external κ (frozen 0.158, no oracle) is shown alongside the oracle: at B = 0.15 it matches the oracle (−0.119) and at B = 0.30 wins (−0.231), beating every internal funnel model; its only cost is the B = 0 over-correction (+0.053). The head-to-head win therefore holds for the method a user can actually run.</w:t>
+      </w:r>
+    </w:p>
     <w:p>
       <w:pPr>
         <w:spacing w:after="120" w:line="276"/>

</xml_diff>

<commit_message>
manuscript: add second-real-network generalisation (linde2015 depression, section 3.6 + Table 5)
Folds the 2nd-network result into the paper: end-to-end application to dat.linde2015 (depression
response log-OR NMA), registry corrections again beat all internal funnel models, PET again
catastrophic (+1.2), diabetes-frozen external kappa transfers. Discussion 'Generalisation' para
added; addresses the single-network limitation with a real second network + effect scale. Honest
network-specific B=0 nuance stated. docx rebuilt+validated (Table 5 present, no leaks).

Co-Authored-By: Claude Opus 4.8 (1M context) <noreply@anthropic.com>
</commit_message>
<xml_diff>
--- a/manuscript/Transport_NMA.docx
+++ b/manuscript/Transport_NMA.docx
@@ -7693,6 +7693,987 @@
     </w:p>
     <w:p>
       <w:pPr>
+        <w:pStyle w:val="Heading2"/>
+      </w:pPr>
+      <w:r>
+        <w:t xml:space="preserve">3.6 Generalisation to a second real network (depression, log-odds scale)</w:t>
+      </w:r>
+    </w:p>
+    <w:p>
+      <w:pPr>
+        <w:spacing w:after="120" w:line="276"/>
+      </w:pPr>
+      <w:r>
+        <w:t xml:space="preserve">To test the method beyond diabetes we applied it end-to-end to a second, independent real network in a different domain and effect scale: dat.linde2015 (metadat), 66 antidepressant RCTs for major depression with arms grouped by class (SSRI, SNRI, TCA, atypical [NaSSa/SARI], MAOI [rMAO-A], plus NRI and Hypericum), outcome = treatment response, reduced to pairwise log-odds-ratio contrasts and fitted with the same engine. The network is sensible (9 treatments, 59 studies, τ = 0.18, I² = 0%; Hypericum/SNRI/TCA/SSRI all beat placebo, OR ≈ 1.7–1.9). We overlaid the real depression-class registry λ and applied the diabetes-frozen external κ = 0.158 as a cross-domain transfer test. On the truth-gate (Table 5), the registry corrections again beat every internal funnel model — PET-PEESE is catastrophic (ΔMCIW0 ≈ +1.2 at every B, worse than on diabetes because log-OR contrasts on few studies are even noisier); trim-and-fill harms; Henmi–Copas is inert. The oracle wins at B ≥ 0.15 and is exactly inert at B = 0, and the diabetes-frozen κ transfers: it improves matched-coverage error at every B, including a mild B = 0 gain (−0.042). That B = 0 behaviour is the reverse of diabetes (+0.05 cost) and is a network-specific bias–variance effect — here the low-λ classes also happen to have small placebo-relative effects, so registry-prescribed shrinkage toward the null reduces tail error rather than adding bias; the oracle remains exactly inert as designed. The core claims — registry beats internal funnel methods, PET catastrophic, external κ deployable and transferable — reproduce on a second real network.</w:t>
+      </w:r>
+    </w:p>
+    <w:p>
+      <w:pPr>
+        <w:spacing w:after="100" w:before="60"/>
+      </w:pPr>
+      <w:r>
+        <w:rPr>
+          <w:b/>
+          <w:bCs/>
+          <w:sz w:val="18"/>
+          <w:szCs w:val="18"/>
+        </w:rPr>
+        <w:t xml:space="preserve">Table 5. </w:t>
+      </w:r>
+      <w:r>
+        <w:rPr>
+          <w:sz w:val="18"/>
+          <w:szCs w:val="18"/>
+        </w:rPr>
+        <w:t xml:space="preserve">Truth-gate on the second real network (dat.linde2015, response log-OR; matched-coverage ΔMCIW0 vs unadjusted NMA). 'ext (diab κ=0.158)' applies the diabetes-frozen external magnitude to the depression network (cross-domain transfer). Source: linde_nma_result.json.</w:t>
+      </w:r>
+    </w:p>
+    <w:tbl>
+      <w:tblPr>
+        <w:tblW w:type="dxa" w:w="9360"/>
+        <w:tblBorders>
+          <w:top w:val="single" w:color="auto" w:sz="4"/>
+          <w:left w:val="single" w:color="auto" w:sz="4"/>
+          <w:bottom w:val="single" w:color="auto" w:sz="4"/>
+          <w:right w:val="single" w:color="auto" w:sz="4"/>
+          <w:insideH w:val="single" w:color="auto" w:sz="4"/>
+          <w:insideV w:val="single" w:color="auto" w:sz="4"/>
+        </w:tblBorders>
+      </w:tblPr>
+      <w:tblGrid>
+        <w:gridCol w:w="1080"/>
+        <w:gridCol w:w="1480"/>
+        <w:gridCol w:w="1720"/>
+        <w:gridCol w:w="1440"/>
+        <w:gridCol w:w="1360"/>
+        <w:gridCol w:w="1300"/>
+        <w:gridCol w:w="980"/>
+      </w:tblGrid>
+      <w:tr>
+        <w:trPr>
+          <w:tblHeader/>
+        </w:trPr>
+        <w:tc>
+          <w:tcPr>
+            <w:tcW w:type="dxa" w:w="1080"/>
+            <w:tcBorders>
+              <w:top w:val="single" w:color="BBBBBB" w:sz="1"/>
+              <w:left w:val="single" w:color="BBBBBB" w:sz="1"/>
+              <w:bottom w:val="single" w:color="BBBBBB" w:sz="1"/>
+              <w:right w:val="single" w:color="BBBBBB" w:sz="1"/>
+            </w:tcBorders>
+            <w:shd w:fill="D5E8F0" w:val="clear"/>
+            <w:tcMar>
+              <w:top w:type="dxa" w:w="60"/>
+              <w:left w:type="dxa" w:w="110"/>
+              <w:bottom w:type="dxa" w:w="60"/>
+              <w:right w:type="dxa" w:w="110"/>
+            </w:tcMar>
+            <w:vAlign w:val="center"/>
+          </w:tcPr>
+          <w:p>
+            <w:pPr>
+              <w:spacing w:after="0"/>
+            </w:pPr>
+            <w:r>
+              <w:rPr>
+                <w:b/>
+                <w:bCs/>
+                <w:sz w:val="16"/>
+                <w:szCs w:val="16"/>
+              </w:rPr>
+              <w:t xml:space="preserve">true B</w:t>
+            </w:r>
+          </w:p>
+        </w:tc>
+        <w:tc>
+          <w:tcPr>
+            <w:tcW w:type="dxa" w:w="1480"/>
+            <w:tcBorders>
+              <w:top w:val="single" w:color="BBBBBB" w:sz="1"/>
+              <w:left w:val="single" w:color="BBBBBB" w:sz="1"/>
+              <w:bottom w:val="single" w:color="BBBBBB" w:sz="1"/>
+              <w:right w:val="single" w:color="BBBBBB" w:sz="1"/>
+            </w:tcBorders>
+            <w:shd w:fill="D5E8F0" w:val="clear"/>
+            <w:tcMar>
+              <w:top w:type="dxa" w:w="60"/>
+              <w:left w:type="dxa" w:w="110"/>
+              <w:bottom w:type="dxa" w:w="60"/>
+              <w:right w:type="dxa" w:w="110"/>
+            </w:tcMar>
+            <w:vAlign w:val="center"/>
+          </w:tcPr>
+          <w:p>
+            <w:pPr>
+              <w:spacing w:after="0"/>
+            </w:pPr>
+            <w:r>
+              <w:rPr>
+                <w:b/>
+                <w:bCs/>
+                <w:sz w:val="16"/>
+                <w:szCs w:val="16"/>
+              </w:rPr>
+              <w:t xml:space="preserve">oracle</w:t>
+            </w:r>
+          </w:p>
+        </w:tc>
+        <w:tc>
+          <w:tcPr>
+            <w:tcW w:type="dxa" w:w="1720"/>
+            <w:tcBorders>
+              <w:top w:val="single" w:color="BBBBBB" w:sz="1"/>
+              <w:left w:val="single" w:color="BBBBBB" w:sz="1"/>
+              <w:bottom w:val="single" w:color="BBBBBB" w:sz="1"/>
+              <w:right w:val="single" w:color="BBBBBB" w:sz="1"/>
+            </w:tcBorders>
+            <w:shd w:fill="D5E8F0" w:val="clear"/>
+            <w:tcMar>
+              <w:top w:type="dxa" w:w="60"/>
+              <w:left w:type="dxa" w:w="110"/>
+              <w:bottom w:type="dxa" w:w="60"/>
+              <w:right w:type="dxa" w:w="110"/>
+            </w:tcMar>
+            <w:vAlign w:val="center"/>
+          </w:tcPr>
+          <w:p>
+            <w:pPr>
+              <w:spacing w:after="0"/>
+            </w:pPr>
+            <w:r>
+              <w:rPr>
+                <w:b/>
+                <w:bCs/>
+                <w:sz w:val="16"/>
+                <w:szCs w:val="16"/>
+              </w:rPr>
+              <w:t xml:space="preserve">ext (diab κ=0.158)</w:t>
+            </w:r>
+          </w:p>
+        </w:tc>
+        <w:tc>
+          <w:tcPr>
+            <w:tcW w:type="dxa" w:w="1440"/>
+            <w:tcBorders>
+              <w:top w:val="single" w:color="BBBBBB" w:sz="1"/>
+              <w:left w:val="single" w:color="BBBBBB" w:sz="1"/>
+              <w:bottom w:val="single" w:color="BBBBBB" w:sz="1"/>
+              <w:right w:val="single" w:color="BBBBBB" w:sz="1"/>
+            </w:tcBorders>
+            <w:shd w:fill="D5E8F0" w:val="clear"/>
+            <w:tcMar>
+              <w:top w:type="dxa" w:w="60"/>
+              <w:left w:type="dxa" w:w="110"/>
+              <w:bottom w:type="dxa" w:w="60"/>
+              <w:right w:type="dxa" w:w="110"/>
+            </w:tcMar>
+            <w:vAlign w:val="center"/>
+          </w:tcPr>
+          <w:p>
+            <w:pPr>
+              <w:spacing w:after="0"/>
+            </w:pPr>
+            <w:r>
+              <w:rPr>
+                <w:b/>
+                <w:bCs/>
+                <w:sz w:val="16"/>
+                <w:szCs w:val="16"/>
+              </w:rPr>
+              <w:t xml:space="preserve">fixed κ=0.5</w:t>
+            </w:r>
+          </w:p>
+        </w:tc>
+        <w:tc>
+          <w:tcPr>
+            <w:tcW w:type="dxa" w:w="1360"/>
+            <w:tcBorders>
+              <w:top w:val="single" w:color="BBBBBB" w:sz="1"/>
+              <w:left w:val="single" w:color="BBBBBB" w:sz="1"/>
+              <w:bottom w:val="single" w:color="BBBBBB" w:sz="1"/>
+              <w:right w:val="single" w:color="BBBBBB" w:sz="1"/>
+            </w:tcBorders>
+            <w:shd w:fill="D5E8F0" w:val="clear"/>
+            <w:tcMar>
+              <w:top w:type="dxa" w:w="60"/>
+              <w:left w:type="dxa" w:w="110"/>
+              <w:bottom w:type="dxa" w:w="60"/>
+              <w:right w:type="dxa" w:w="110"/>
+            </w:tcMar>
+            <w:vAlign w:val="center"/>
+          </w:tcPr>
+          <w:p>
+            <w:pPr>
+              <w:spacing w:after="0"/>
+            </w:pPr>
+            <w:r>
+              <w:rPr>
+                <w:b/>
+                <w:bCs/>
+                <w:sz w:val="16"/>
+                <w:szCs w:val="16"/>
+              </w:rPr>
+              <w:t xml:space="preserve">PET</w:t>
+            </w:r>
+          </w:p>
+        </w:tc>
+        <w:tc>
+          <w:tcPr>
+            <w:tcW w:type="dxa" w:w="1300"/>
+            <w:tcBorders>
+              <w:top w:val="single" w:color="BBBBBB" w:sz="1"/>
+              <w:left w:val="single" w:color="BBBBBB" w:sz="1"/>
+              <w:bottom w:val="single" w:color="BBBBBB" w:sz="1"/>
+              <w:right w:val="single" w:color="BBBBBB" w:sz="1"/>
+            </w:tcBorders>
+            <w:shd w:fill="D5E8F0" w:val="clear"/>
+            <w:tcMar>
+              <w:top w:type="dxa" w:w="60"/>
+              <w:left w:type="dxa" w:w="110"/>
+              <w:bottom w:type="dxa" w:w="60"/>
+              <w:right w:type="dxa" w:w="110"/>
+            </w:tcMar>
+            <w:vAlign w:val="center"/>
+          </w:tcPr>
+          <w:p>
+            <w:pPr>
+              <w:spacing w:after="0"/>
+            </w:pPr>
+            <w:r>
+              <w:rPr>
+                <w:b/>
+                <w:bCs/>
+                <w:sz w:val="16"/>
+                <w:szCs w:val="16"/>
+              </w:rPr>
+              <w:t xml:space="preserve">TF</w:t>
+            </w:r>
+          </w:p>
+        </w:tc>
+        <w:tc>
+          <w:tcPr>
+            <w:tcW w:type="dxa" w:w="980"/>
+            <w:tcBorders>
+              <w:top w:val="single" w:color="BBBBBB" w:sz="1"/>
+              <w:left w:val="single" w:color="BBBBBB" w:sz="1"/>
+              <w:bottom w:val="single" w:color="BBBBBB" w:sz="1"/>
+              <w:right w:val="single" w:color="BBBBBB" w:sz="1"/>
+            </w:tcBorders>
+            <w:shd w:fill="D5E8F0" w:val="clear"/>
+            <w:tcMar>
+              <w:top w:type="dxa" w:w="60"/>
+              <w:left w:type="dxa" w:w="110"/>
+              <w:bottom w:type="dxa" w:w="60"/>
+              <w:right w:type="dxa" w:w="110"/>
+            </w:tcMar>
+            <w:vAlign w:val="center"/>
+          </w:tcPr>
+          <w:p>
+            <w:pPr>
+              <w:spacing w:after="0"/>
+            </w:pPr>
+            <w:r>
+              <w:rPr>
+                <w:b/>
+                <w:bCs/>
+                <w:sz w:val="16"/>
+                <w:szCs w:val="16"/>
+              </w:rPr>
+              <w:t xml:space="preserve">HC</w:t>
+            </w:r>
+          </w:p>
+        </w:tc>
+      </w:tr>
+      <w:tr>
+        <w:tc>
+          <w:tcPr>
+            <w:tcW w:type="dxa" w:w="1080"/>
+            <w:tcBorders>
+              <w:top w:val="single" w:color="BBBBBB" w:sz="1"/>
+              <w:left w:val="single" w:color="BBBBBB" w:sz="1"/>
+              <w:bottom w:val="single" w:color="BBBBBB" w:sz="1"/>
+              <w:right w:val="single" w:color="BBBBBB" w:sz="1"/>
+            </w:tcBorders>
+            <w:tcMar>
+              <w:top w:type="dxa" w:w="60"/>
+              <w:left w:type="dxa" w:w="110"/>
+              <w:bottom w:type="dxa" w:w="60"/>
+              <w:right w:type="dxa" w:w="110"/>
+            </w:tcMar>
+            <w:vAlign w:val="center"/>
+          </w:tcPr>
+          <w:p>
+            <w:pPr>
+              <w:spacing w:after="0"/>
+            </w:pPr>
+            <w:r>
+              <w:rPr>
+                <w:b w:val="false"/>
+                <w:bCs w:val="false"/>
+                <w:sz w:val="16"/>
+                <w:szCs w:val="16"/>
+              </w:rPr>
+              <w:t xml:space="preserve">0.00</w:t>
+            </w:r>
+          </w:p>
+        </w:tc>
+        <w:tc>
+          <w:tcPr>
+            <w:tcW w:type="dxa" w:w="1480"/>
+            <w:tcBorders>
+              <w:top w:val="single" w:color="BBBBBB" w:sz="1"/>
+              <w:left w:val="single" w:color="BBBBBB" w:sz="1"/>
+              <w:bottom w:val="single" w:color="BBBBBB" w:sz="1"/>
+              <w:right w:val="single" w:color="BBBBBB" w:sz="1"/>
+            </w:tcBorders>
+            <w:tcMar>
+              <w:top w:type="dxa" w:w="60"/>
+              <w:left w:type="dxa" w:w="110"/>
+              <w:bottom w:type="dxa" w:w="60"/>
+              <w:right w:type="dxa" w:w="110"/>
+            </w:tcMar>
+            <w:vAlign w:val="center"/>
+          </w:tcPr>
+          <w:p>
+            <w:pPr>
+              <w:spacing w:after="0"/>
+            </w:pPr>
+            <w:r>
+              <w:rPr>
+                <w:b w:val="false"/>
+                <w:bCs w:val="false"/>
+                <w:sz w:val="16"/>
+                <w:szCs w:val="16"/>
+              </w:rPr>
+              <w:t xml:space="preserve">+0.000 tie</w:t>
+            </w:r>
+          </w:p>
+        </w:tc>
+        <w:tc>
+          <w:tcPr>
+            <w:tcW w:type="dxa" w:w="1720"/>
+            <w:tcBorders>
+              <w:top w:val="single" w:color="BBBBBB" w:sz="1"/>
+              <w:left w:val="single" w:color="BBBBBB" w:sz="1"/>
+              <w:bottom w:val="single" w:color="BBBBBB" w:sz="1"/>
+              <w:right w:val="single" w:color="BBBBBB" w:sz="1"/>
+            </w:tcBorders>
+            <w:tcMar>
+              <w:top w:type="dxa" w:w="60"/>
+              <w:left w:type="dxa" w:w="110"/>
+              <w:bottom w:type="dxa" w:w="60"/>
+              <w:right w:type="dxa" w:w="110"/>
+            </w:tcMar>
+            <w:vAlign w:val="center"/>
+          </w:tcPr>
+          <w:p>
+            <w:pPr>
+              <w:spacing w:after="0"/>
+            </w:pPr>
+            <w:r>
+              <w:rPr>
+                <w:b/>
+                <w:bCs/>
+                <w:sz w:val="16"/>
+                <w:szCs w:val="16"/>
+              </w:rPr>
+              <w:t xml:space="preserve">−0.042 WINS</w:t>
+            </w:r>
+          </w:p>
+        </w:tc>
+        <w:tc>
+          <w:tcPr>
+            <w:tcW w:type="dxa" w:w="1440"/>
+            <w:tcBorders>
+              <w:top w:val="single" w:color="BBBBBB" w:sz="1"/>
+              <w:left w:val="single" w:color="BBBBBB" w:sz="1"/>
+              <w:bottom w:val="single" w:color="BBBBBB" w:sz="1"/>
+              <w:right w:val="single" w:color="BBBBBB" w:sz="1"/>
+            </w:tcBorders>
+            <w:tcMar>
+              <w:top w:type="dxa" w:w="60"/>
+              <w:left w:type="dxa" w:w="110"/>
+              <w:bottom w:type="dxa" w:w="60"/>
+              <w:right w:type="dxa" w:w="110"/>
+            </w:tcMar>
+            <w:vAlign w:val="center"/>
+          </w:tcPr>
+          <w:p>
+            <w:pPr>
+              <w:spacing w:after="0"/>
+            </w:pPr>
+            <w:r>
+              <w:rPr>
+                <w:b w:val="false"/>
+                <w:bCs w:val="false"/>
+                <w:sz w:val="16"/>
+                <w:szCs w:val="16"/>
+              </w:rPr>
+              <w:t xml:space="preserve">−0.025 tie</w:t>
+            </w:r>
+          </w:p>
+        </w:tc>
+        <w:tc>
+          <w:tcPr>
+            <w:tcW w:type="dxa" w:w="1360"/>
+            <w:tcBorders>
+              <w:top w:val="single" w:color="BBBBBB" w:sz="1"/>
+              <w:left w:val="single" w:color="BBBBBB" w:sz="1"/>
+              <w:bottom w:val="single" w:color="BBBBBB" w:sz="1"/>
+              <w:right w:val="single" w:color="BBBBBB" w:sz="1"/>
+            </w:tcBorders>
+            <w:tcMar>
+              <w:top w:type="dxa" w:w="60"/>
+              <w:left w:type="dxa" w:w="110"/>
+              <w:bottom w:type="dxa" w:w="60"/>
+              <w:right w:type="dxa" w:w="110"/>
+            </w:tcMar>
+            <w:vAlign w:val="center"/>
+          </w:tcPr>
+          <w:p>
+            <w:pPr>
+              <w:spacing w:after="0"/>
+            </w:pPr>
+            <w:r>
+              <w:rPr>
+                <w:b w:val="false"/>
+                <w:bCs w:val="false"/>
+                <w:sz w:val="16"/>
+                <w:szCs w:val="16"/>
+              </w:rPr>
+              <w:t xml:space="preserve">+1.224 HARMS</w:t>
+            </w:r>
+          </w:p>
+        </w:tc>
+        <w:tc>
+          <w:tcPr>
+            <w:tcW w:type="dxa" w:w="1300"/>
+            <w:tcBorders>
+              <w:top w:val="single" w:color="BBBBBB" w:sz="1"/>
+              <w:left w:val="single" w:color="BBBBBB" w:sz="1"/>
+              <w:bottom w:val="single" w:color="BBBBBB" w:sz="1"/>
+              <w:right w:val="single" w:color="BBBBBB" w:sz="1"/>
+            </w:tcBorders>
+            <w:tcMar>
+              <w:top w:type="dxa" w:w="60"/>
+              <w:left w:type="dxa" w:w="110"/>
+              <w:bottom w:type="dxa" w:w="60"/>
+              <w:right w:type="dxa" w:w="110"/>
+            </w:tcMar>
+            <w:vAlign w:val="center"/>
+          </w:tcPr>
+          <w:p>
+            <w:pPr>
+              <w:spacing w:after="0"/>
+            </w:pPr>
+            <w:r>
+              <w:rPr>
+                <w:b w:val="false"/>
+                <w:bCs w:val="false"/>
+                <w:sz w:val="16"/>
+                <w:szCs w:val="16"/>
+              </w:rPr>
+              <w:t xml:space="preserve">+0.044 HARMS</w:t>
+            </w:r>
+          </w:p>
+        </w:tc>
+        <w:tc>
+          <w:tcPr>
+            <w:tcW w:type="dxa" w:w="980"/>
+            <w:tcBorders>
+              <w:top w:val="single" w:color="BBBBBB" w:sz="1"/>
+              <w:left w:val="single" w:color="BBBBBB" w:sz="1"/>
+              <w:bottom w:val="single" w:color="BBBBBB" w:sz="1"/>
+              <w:right w:val="single" w:color="BBBBBB" w:sz="1"/>
+            </w:tcBorders>
+            <w:tcMar>
+              <w:top w:type="dxa" w:w="60"/>
+              <w:left w:type="dxa" w:w="110"/>
+              <w:bottom w:type="dxa" w:w="60"/>
+              <w:right w:type="dxa" w:w="110"/>
+            </w:tcMar>
+            <w:vAlign w:val="center"/>
+          </w:tcPr>
+          <w:p>
+            <w:pPr>
+              <w:spacing w:after="0"/>
+            </w:pPr>
+            <w:r>
+              <w:rPr>
+                <w:b w:val="false"/>
+                <w:bCs w:val="false"/>
+                <w:sz w:val="16"/>
+                <w:szCs w:val="16"/>
+              </w:rPr>
+              <w:t xml:space="preserve">+0.000 tie</w:t>
+            </w:r>
+          </w:p>
+        </w:tc>
+      </w:tr>
+      <w:tr>
+        <w:tc>
+          <w:tcPr>
+            <w:tcW w:type="dxa" w:w="1080"/>
+            <w:tcBorders>
+              <w:top w:val="single" w:color="BBBBBB" w:sz="1"/>
+              <w:left w:val="single" w:color="BBBBBB" w:sz="1"/>
+              <w:bottom w:val="single" w:color="BBBBBB" w:sz="1"/>
+              <w:right w:val="single" w:color="BBBBBB" w:sz="1"/>
+            </w:tcBorders>
+            <w:tcMar>
+              <w:top w:type="dxa" w:w="60"/>
+              <w:left w:type="dxa" w:w="110"/>
+              <w:bottom w:type="dxa" w:w="60"/>
+              <w:right w:type="dxa" w:w="110"/>
+            </w:tcMar>
+            <w:vAlign w:val="center"/>
+          </w:tcPr>
+          <w:p>
+            <w:pPr>
+              <w:spacing w:after="0"/>
+            </w:pPr>
+            <w:r>
+              <w:rPr>
+                <w:b w:val="false"/>
+                <w:bCs w:val="false"/>
+                <w:sz w:val="16"/>
+                <w:szCs w:val="16"/>
+              </w:rPr>
+              <w:t xml:space="preserve">0.15</w:t>
+            </w:r>
+          </w:p>
+        </w:tc>
+        <w:tc>
+          <w:tcPr>
+            <w:tcW w:type="dxa" w:w="1480"/>
+            <w:tcBorders>
+              <w:top w:val="single" w:color="BBBBBB" w:sz="1"/>
+              <w:left w:val="single" w:color="BBBBBB" w:sz="1"/>
+              <w:bottom w:val="single" w:color="BBBBBB" w:sz="1"/>
+              <w:right w:val="single" w:color="BBBBBB" w:sz="1"/>
+            </w:tcBorders>
+            <w:tcMar>
+              <w:top w:type="dxa" w:w="60"/>
+              <w:left w:type="dxa" w:w="110"/>
+              <w:bottom w:type="dxa" w:w="60"/>
+              <w:right w:type="dxa" w:w="110"/>
+            </w:tcMar>
+            <w:vAlign w:val="center"/>
+          </w:tcPr>
+          <w:p>
+            <w:pPr>
+              <w:spacing w:after="0"/>
+            </w:pPr>
+            <w:r>
+              <w:rPr>
+                <w:b w:val="false"/>
+                <w:bCs w:val="false"/>
+                <w:sz w:val="16"/>
+                <w:szCs w:val="16"/>
+              </w:rPr>
+              <w:t xml:space="preserve">−0.062 WINS</w:t>
+            </w:r>
+          </w:p>
+        </w:tc>
+        <w:tc>
+          <w:tcPr>
+            <w:tcW w:type="dxa" w:w="1720"/>
+            <w:tcBorders>
+              <w:top w:val="single" w:color="BBBBBB" w:sz="1"/>
+              <w:left w:val="single" w:color="BBBBBB" w:sz="1"/>
+              <w:bottom w:val="single" w:color="BBBBBB" w:sz="1"/>
+              <w:right w:val="single" w:color="BBBBBB" w:sz="1"/>
+            </w:tcBorders>
+            <w:tcMar>
+              <w:top w:type="dxa" w:w="60"/>
+              <w:left w:type="dxa" w:w="110"/>
+              <w:bottom w:type="dxa" w:w="60"/>
+              <w:right w:type="dxa" w:w="110"/>
+            </w:tcMar>
+            <w:vAlign w:val="center"/>
+          </w:tcPr>
+          <w:p>
+            <w:pPr>
+              <w:spacing w:after="0"/>
+            </w:pPr>
+            <w:r>
+              <w:rPr>
+                <w:b/>
+                <w:bCs/>
+                <w:sz w:val="16"/>
+                <w:szCs w:val="16"/>
+              </w:rPr>
+              <w:t xml:space="preserve">−0.065 WINS</w:t>
+            </w:r>
+          </w:p>
+        </w:tc>
+        <w:tc>
+          <w:tcPr>
+            <w:tcW w:type="dxa" w:w="1440"/>
+            <w:tcBorders>
+              <w:top w:val="single" w:color="BBBBBB" w:sz="1"/>
+              <w:left w:val="single" w:color="BBBBBB" w:sz="1"/>
+              <w:bottom w:val="single" w:color="BBBBBB" w:sz="1"/>
+              <w:right w:val="single" w:color="BBBBBB" w:sz="1"/>
+            </w:tcBorders>
+            <w:tcMar>
+              <w:top w:type="dxa" w:w="60"/>
+              <w:left w:type="dxa" w:w="110"/>
+              <w:bottom w:type="dxa" w:w="60"/>
+              <w:right w:type="dxa" w:w="110"/>
+            </w:tcMar>
+            <w:vAlign w:val="center"/>
+          </w:tcPr>
+          <w:p>
+            <w:pPr>
+              <w:spacing w:after="0"/>
+            </w:pPr>
+            <w:r>
+              <w:rPr>
+                <w:b w:val="false"/>
+                <w:bCs w:val="false"/>
+                <w:sz w:val="16"/>
+                <w:szCs w:val="16"/>
+              </w:rPr>
+              <w:t xml:space="preserve">−0.088 WINS</w:t>
+            </w:r>
+          </w:p>
+        </w:tc>
+        <w:tc>
+          <w:tcPr>
+            <w:tcW w:type="dxa" w:w="1360"/>
+            <w:tcBorders>
+              <w:top w:val="single" w:color="BBBBBB" w:sz="1"/>
+              <w:left w:val="single" w:color="BBBBBB" w:sz="1"/>
+              <w:bottom w:val="single" w:color="BBBBBB" w:sz="1"/>
+              <w:right w:val="single" w:color="BBBBBB" w:sz="1"/>
+            </w:tcBorders>
+            <w:tcMar>
+              <w:top w:type="dxa" w:w="60"/>
+              <w:left w:type="dxa" w:w="110"/>
+              <w:bottom w:type="dxa" w:w="60"/>
+              <w:right w:type="dxa" w:w="110"/>
+            </w:tcMar>
+            <w:vAlign w:val="center"/>
+          </w:tcPr>
+          <w:p>
+            <w:pPr>
+              <w:spacing w:after="0"/>
+            </w:pPr>
+            <w:r>
+              <w:rPr>
+                <w:b w:val="false"/>
+                <w:bCs w:val="false"/>
+                <w:sz w:val="16"/>
+                <w:szCs w:val="16"/>
+              </w:rPr>
+              <w:t xml:space="preserve">+1.195 HARMS</w:t>
+            </w:r>
+          </w:p>
+        </w:tc>
+        <w:tc>
+          <w:tcPr>
+            <w:tcW w:type="dxa" w:w="1300"/>
+            <w:tcBorders>
+              <w:top w:val="single" w:color="BBBBBB" w:sz="1"/>
+              <w:left w:val="single" w:color="BBBBBB" w:sz="1"/>
+              <w:bottom w:val="single" w:color="BBBBBB" w:sz="1"/>
+              <w:right w:val="single" w:color="BBBBBB" w:sz="1"/>
+            </w:tcBorders>
+            <w:tcMar>
+              <w:top w:type="dxa" w:w="60"/>
+              <w:left w:type="dxa" w:w="110"/>
+              <w:bottom w:type="dxa" w:w="60"/>
+              <w:right w:type="dxa" w:w="110"/>
+            </w:tcMar>
+            <w:vAlign w:val="center"/>
+          </w:tcPr>
+          <w:p>
+            <w:pPr>
+              <w:spacing w:after="0"/>
+            </w:pPr>
+            <w:r>
+              <w:rPr>
+                <w:b w:val="false"/>
+                <w:bCs w:val="false"/>
+                <w:sz w:val="16"/>
+                <w:szCs w:val="16"/>
+              </w:rPr>
+              <w:t xml:space="preserve">+0.024 HARMS</w:t>
+            </w:r>
+          </w:p>
+        </w:tc>
+        <w:tc>
+          <w:tcPr>
+            <w:tcW w:type="dxa" w:w="980"/>
+            <w:tcBorders>
+              <w:top w:val="single" w:color="BBBBBB" w:sz="1"/>
+              <w:left w:val="single" w:color="BBBBBB" w:sz="1"/>
+              <w:bottom w:val="single" w:color="BBBBBB" w:sz="1"/>
+              <w:right w:val="single" w:color="BBBBBB" w:sz="1"/>
+            </w:tcBorders>
+            <w:tcMar>
+              <w:top w:type="dxa" w:w="60"/>
+              <w:left w:type="dxa" w:w="110"/>
+              <w:bottom w:type="dxa" w:w="60"/>
+              <w:right w:type="dxa" w:w="110"/>
+            </w:tcMar>
+            <w:vAlign w:val="center"/>
+          </w:tcPr>
+          <w:p>
+            <w:pPr>
+              <w:spacing w:after="0"/>
+            </w:pPr>
+            <w:r>
+              <w:rPr>
+                <w:b w:val="false"/>
+                <w:bCs w:val="false"/>
+                <w:sz w:val="16"/>
+                <w:szCs w:val="16"/>
+              </w:rPr>
+              <w:t xml:space="preserve">+0.000 tie</w:t>
+            </w:r>
+          </w:p>
+        </w:tc>
+      </w:tr>
+      <w:tr>
+        <w:tc>
+          <w:tcPr>
+            <w:tcW w:type="dxa" w:w="1080"/>
+            <w:tcBorders>
+              <w:top w:val="single" w:color="BBBBBB" w:sz="1"/>
+              <w:left w:val="single" w:color="BBBBBB" w:sz="1"/>
+              <w:bottom w:val="single" w:color="BBBBBB" w:sz="1"/>
+              <w:right w:val="single" w:color="BBBBBB" w:sz="1"/>
+            </w:tcBorders>
+            <w:tcMar>
+              <w:top w:type="dxa" w:w="60"/>
+              <w:left w:type="dxa" w:w="110"/>
+              <w:bottom w:type="dxa" w:w="60"/>
+              <w:right w:type="dxa" w:w="110"/>
+            </w:tcMar>
+            <w:vAlign w:val="center"/>
+          </w:tcPr>
+          <w:p>
+            <w:pPr>
+              <w:spacing w:after="0"/>
+            </w:pPr>
+            <w:r>
+              <w:rPr>
+                <w:b w:val="false"/>
+                <w:bCs w:val="false"/>
+                <w:sz w:val="16"/>
+                <w:szCs w:val="16"/>
+              </w:rPr>
+              <w:t xml:space="preserve">0.30</w:t>
+            </w:r>
+          </w:p>
+        </w:tc>
+        <w:tc>
+          <w:tcPr>
+            <w:tcW w:type="dxa" w:w="1480"/>
+            <w:tcBorders>
+              <w:top w:val="single" w:color="BBBBBB" w:sz="1"/>
+              <w:left w:val="single" w:color="BBBBBB" w:sz="1"/>
+              <w:bottom w:val="single" w:color="BBBBBB" w:sz="1"/>
+              <w:right w:val="single" w:color="BBBBBB" w:sz="1"/>
+            </w:tcBorders>
+            <w:tcMar>
+              <w:top w:type="dxa" w:w="60"/>
+              <w:left w:type="dxa" w:w="110"/>
+              <w:bottom w:type="dxa" w:w="60"/>
+              <w:right w:type="dxa" w:w="110"/>
+            </w:tcMar>
+            <w:vAlign w:val="center"/>
+          </w:tcPr>
+          <w:p>
+            <w:pPr>
+              <w:spacing w:after="0"/>
+            </w:pPr>
+            <w:r>
+              <w:rPr>
+                <w:b w:val="false"/>
+                <w:bCs w:val="false"/>
+                <w:sz w:val="16"/>
+                <w:szCs w:val="16"/>
+              </w:rPr>
+              <w:t xml:space="preserve">−0.133 WINS</w:t>
+            </w:r>
+          </w:p>
+        </w:tc>
+        <w:tc>
+          <w:tcPr>
+            <w:tcW w:type="dxa" w:w="1720"/>
+            <w:tcBorders>
+              <w:top w:val="single" w:color="BBBBBB" w:sz="1"/>
+              <w:left w:val="single" w:color="BBBBBB" w:sz="1"/>
+              <w:bottom w:val="single" w:color="BBBBBB" w:sz="1"/>
+              <w:right w:val="single" w:color="BBBBBB" w:sz="1"/>
+            </w:tcBorders>
+            <w:tcMar>
+              <w:top w:type="dxa" w:w="60"/>
+              <w:left w:type="dxa" w:w="110"/>
+              <w:bottom w:type="dxa" w:w="60"/>
+              <w:right w:type="dxa" w:w="110"/>
+            </w:tcMar>
+            <w:vAlign w:val="center"/>
+          </w:tcPr>
+          <w:p>
+            <w:pPr>
+              <w:spacing w:after="0"/>
+            </w:pPr>
+            <w:r>
+              <w:rPr>
+                <w:b/>
+                <w:bCs/>
+                <w:sz w:val="16"/>
+                <w:szCs w:val="16"/>
+              </w:rPr>
+              <w:t xml:space="preserve">−0.084 WINS</w:t>
+            </w:r>
+          </w:p>
+        </w:tc>
+        <w:tc>
+          <w:tcPr>
+            <w:tcW w:type="dxa" w:w="1440"/>
+            <w:tcBorders>
+              <w:top w:val="single" w:color="BBBBBB" w:sz="1"/>
+              <w:left w:val="single" w:color="BBBBBB" w:sz="1"/>
+              <w:bottom w:val="single" w:color="BBBBBB" w:sz="1"/>
+              <w:right w:val="single" w:color="BBBBBB" w:sz="1"/>
+            </w:tcBorders>
+            <w:tcMar>
+              <w:top w:type="dxa" w:w="60"/>
+              <w:left w:type="dxa" w:w="110"/>
+              <w:bottom w:type="dxa" w:w="60"/>
+              <w:right w:type="dxa" w:w="110"/>
+            </w:tcMar>
+            <w:vAlign w:val="center"/>
+          </w:tcPr>
+          <w:p>
+            <w:pPr>
+              <w:spacing w:after="0"/>
+            </w:pPr>
+            <w:r>
+              <w:rPr>
+                <w:b w:val="false"/>
+                <w:bCs w:val="false"/>
+                <w:sz w:val="16"/>
+                <w:szCs w:val="16"/>
+              </w:rPr>
+              <w:t xml:space="preserve">−0.146 WINS</w:t>
+            </w:r>
+          </w:p>
+        </w:tc>
+        <w:tc>
+          <w:tcPr>
+            <w:tcW w:type="dxa" w:w="1360"/>
+            <w:tcBorders>
+              <w:top w:val="single" w:color="BBBBBB" w:sz="1"/>
+              <w:left w:val="single" w:color="BBBBBB" w:sz="1"/>
+              <w:bottom w:val="single" w:color="BBBBBB" w:sz="1"/>
+              <w:right w:val="single" w:color="BBBBBB" w:sz="1"/>
+            </w:tcBorders>
+            <w:tcMar>
+              <w:top w:type="dxa" w:w="60"/>
+              <w:left w:type="dxa" w:w="110"/>
+              <w:bottom w:type="dxa" w:w="60"/>
+              <w:right w:type="dxa" w:w="110"/>
+            </w:tcMar>
+            <w:vAlign w:val="center"/>
+          </w:tcPr>
+          <w:p>
+            <w:pPr>
+              <w:spacing w:after="0"/>
+            </w:pPr>
+            <w:r>
+              <w:rPr>
+                <w:b w:val="false"/>
+                <w:bCs w:val="false"/>
+                <w:sz w:val="16"/>
+                <w:szCs w:val="16"/>
+              </w:rPr>
+              <w:t xml:space="preserve">+1.174 HARMS</w:t>
+            </w:r>
+          </w:p>
+        </w:tc>
+        <w:tc>
+          <w:tcPr>
+            <w:tcW w:type="dxa" w:w="1300"/>
+            <w:tcBorders>
+              <w:top w:val="single" w:color="BBBBBB" w:sz="1"/>
+              <w:left w:val="single" w:color="BBBBBB" w:sz="1"/>
+              <w:bottom w:val="single" w:color="BBBBBB" w:sz="1"/>
+              <w:right w:val="single" w:color="BBBBBB" w:sz="1"/>
+            </w:tcBorders>
+            <w:tcMar>
+              <w:top w:type="dxa" w:w="60"/>
+              <w:left w:type="dxa" w:w="110"/>
+              <w:bottom w:type="dxa" w:w="60"/>
+              <w:right w:type="dxa" w:w="110"/>
+            </w:tcMar>
+            <w:vAlign w:val="center"/>
+          </w:tcPr>
+          <w:p>
+            <w:pPr>
+              <w:spacing w:after="0"/>
+            </w:pPr>
+            <w:r>
+              <w:rPr>
+                <w:b w:val="false"/>
+                <w:bCs w:val="false"/>
+                <w:sz w:val="16"/>
+                <w:szCs w:val="16"/>
+              </w:rPr>
+              <w:t xml:space="preserve">+0.046 HARMS</w:t>
+            </w:r>
+          </w:p>
+        </w:tc>
+        <w:tc>
+          <w:tcPr>
+            <w:tcW w:type="dxa" w:w="980"/>
+            <w:tcBorders>
+              <w:top w:val="single" w:color="BBBBBB" w:sz="1"/>
+              <w:left w:val="single" w:color="BBBBBB" w:sz="1"/>
+              <w:bottom w:val="single" w:color="BBBBBB" w:sz="1"/>
+              <w:right w:val="single" w:color="BBBBBB" w:sz="1"/>
+            </w:tcBorders>
+            <w:tcMar>
+              <w:top w:type="dxa" w:w="60"/>
+              <w:left w:type="dxa" w:w="110"/>
+              <w:bottom w:type="dxa" w:w="60"/>
+              <w:right w:type="dxa" w:w="110"/>
+            </w:tcMar>
+            <w:vAlign w:val="center"/>
+          </w:tcPr>
+          <w:p>
+            <w:pPr>
+              <w:spacing w:after="0"/>
+            </w:pPr>
+            <w:r>
+              <w:rPr>
+                <w:b w:val="false"/>
+                <w:bCs w:val="false"/>
+                <w:sz w:val="16"/>
+                <w:szCs w:val="16"/>
+              </w:rPr>
+              <w:t xml:space="preserve">+0.000 tie</w:t>
+            </w:r>
+          </w:p>
+        </w:tc>
+      </w:tr>
+    </w:tbl>
+    <w:p>
+      <w:pPr>
+        <w:spacing w:after="120" w:line="276"/>
+      </w:pPr>
+      <w:r>
+        <w:t xml:space="preserve"/>
+      </w:r>
+    </w:p>
+    <w:p>
+      <w:pPr>
         <w:pStyle w:val="Heading1"/>
       </w:pPr>
       <w:r>
@@ -7742,6 +8723,21 @@
       </w:r>
       <w:r>
         <w:t xml:space="preserve">Apply κ_pooled·(1 − λₜ) where selection is a priori expected — a selection-prone class flagged by a low registry λ — where the correction is oracle-matching. Accept the bounded +0.05 MCIW0 over-correction as the honest cost of operating without a presence gate. Do not apply it as a blanket adjustment to networks with no prior reason to suspect selection.</w:t>
+      </w:r>
+    </w:p>
+    <w:p>
+      <w:pPr>
+        <w:spacing w:after="120" w:line="276"/>
+      </w:pPr>
+      <w:r>
+        <w:rPr>
+          <w:b/>
+          <w:bCs/>
+        </w:rPr>
+        <w:t xml:space="preserve">Generalisation. </w:t>
+      </w:r>
+      <w:r>
+        <w:t xml:space="preserve">The core results are not diabetes-specific: they reproduce on a second real network in a different domain and effect scale (depression, response log-odds; §3.6), where the registry corrections again beat every internal funnel model, PET-PEESE is again catastrophic, and the diabetes-frozen external κ transfers as a beneficial correction. The external validation (published-versus-registered gap tracking registry severity) also reproduces in the antidepressant domain on a scale-invariant measure.</w:t>
       </w:r>
     </w:p>
     <w:p>

</xml_diff>

<commit_message>
manuscript+report: log the Codex Seat A cross-vendor witness (CONFIRMS) in the validation section
§3.4 gains an 'Independent cross-vendor witness' paragraph: Codex (gpt-5.5), zero ubcma imports,
reproduced kappa_pooled/corr to 4dp and the truth-gate relationship (external tracks oracle at
B=0.15 within 0.0002) on its own NMA engine; verdict CONFIRMS. REPORT + docx updated (validated).

Co-Authored-By: Claude Opus 4.8 (1M context) <noreply@anthropic.com>
</commit_message>
<xml_diff>
--- a/manuscript/Transport_NMA.docx
+++ b/manuscript/Transport_NMA.docx
@@ -5969,6 +5969,21 @@
       </w:pPr>
       <w:r>
         <w:t xml:space="preserve">Replacing the oracle with the frozen external κ (§2.5) is the decisive test (Table 4, Figure 3). The pooled external magnitude κ = 0.158 matches the oracle at B=0.15 — ΔMCIW0 −0.119 vs oracle −0.118 (Regime A) and −0.098 vs −0.097 (Regime B) — and wins across every B ≥ 0.15 in both regimes. It decisively beats the naive fixed κ = 0.5, which harms at B=0 by +0.42 and needs B ≥ 0.30 merely to help. The slope estimate κ = 0.263 matches the oracle exactly at B=0.263 by construction and wins for B ≥ 0.15. The correction is thus, for the first time, direction + calibrated magnitude: external registry data supplied the strength the sparse network could not.</w:t>
+      </w:r>
+    </w:p>
+    <w:p>
+      <w:pPr>
+        <w:spacing w:after="120" w:line="276"/>
+      </w:pPr>
+      <w:r>
+        <w:rPr>
+          <w:b/>
+          <w:bCs/>
+        </w:rPr>
+        <w:t xml:space="preserve">Independent cross-vendor witness. </w:t>
+      </w:r>
+      <w:r>
+        <w:t xml:space="preserve">An external vendor (Codex, GPT-5.5), given only the per-analysis records, the senn2013 dataset, and a written specification — and instructed to import none of our code — implemented its own aggregation, its own random-effects NMA, and its own bootstrap. It reproduced the engine-free claims to four decimal places (κ_pooled 0.15759 vs 0.1576; corr +0.50142 vs +0.501; identical per-class κ_MD and class set) and, on its own NMA engine, reproduced the truth-gate relationship exactly: the frozen external κ tracks the oracle at B = 0.15 (its ΔMCIW0 −0.1020 vs oracle −0.1018, within 0.0002; both win), over-corrects at B = 0 (+0.055), and under-corrects at B = 0.30 — verdict "CONFIRMS". Absolute ΔMCIW0 levels differ slightly from ours (−0.102 vs −0.119 at B = 0.15) only because of the independent NMA implementation and RNG; the conclusion is identical.</w:t>
       </w:r>
     </w:p>
     <w:p>

</xml_diff>

<commit_message>
transport-nma: honest hedge for the single-cell Henmi-Copas exception (cross-vendor flagged)
Codex's witness flagged that HC posts a negligible formal WINS (dMCIW0 -0.008 [-0.023,-0.001]) in the
single most extreme cell (B=0.30, Regime B) -- within MC noise, an order of magnitude below the registry
margin. Added a calibrated hedge in manuscript sec 3.3 + abstract-adjacent + conclusion + REPORT verdict
so 'no internal model ever wins' is not over-broad; HC remains non-deployable (inert-to-harmful elsewhere).
Also credited the cross-vendor check for surfacing it in the sec 3.4 witness paragraph. docx rebuilt+validated.

Co-Authored-By: Claude Opus 4.8 (1M context) <noreply@anthropic.com>
</commit_message>
<xml_diff>
--- a/manuscript/Transport_NMA.docx
+++ b/manuscript/Transport_NMA.docx
@@ -4914,7 +4914,7 @@
         <w:spacing w:after="120" w:line="276"/>
       </w:pPr>
       <w:r>
-        <w:t xml:space="preserve">On the simulation, each internal corrector is applied network-consistently — it estimates a per-treatment bias from that treatment's direct placebo-relative studies and subtracts it from the same league estimate the registry method adjusts, so methods differ only in how they estimate the bias (Table 3). The registry-λ correction (oracle magnitude) is the only reliable winner: ΔMCIW0 −0.118 (B=0.15) and −0.306 (B=0.30) in Regime A, and −0.097 / −0.222 in Regime B, exactly inert at B=0. PET-PEESE over-corrects catastrophically (+0.58 to +0.68 in every cell, both regimes), because a per-treatment funnel regression on three-to-six studies has enormous intercept variance — even in Regime B where it is correctly specified. Trim-and-fill and Henmi–Copas are inert-to-harmful; Copas–Shi is infeasible on the network. The registry λ is an external, near-zero-sampling-variance direction-of-selection signal the internal methods cannot recover from a handful of studies.</w:t>
+        <w:t xml:space="preserve">On the simulation, each internal corrector is applied network-consistently — it estimates a per-treatment bias from that treatment's direct placebo-relative studies and subtracts it from the same league estimate the registry method adjusts, so methods differ only in how they estimate the bias (Table 3). The registry-λ correction (oracle magnitude) is the only reliable winner: ΔMCIW0 −0.118 (B=0.15) and −0.306 (B=0.30) in Regime A, and −0.097 / −0.222 in Regime B, exactly inert at B=0. PET-PEESE over-corrects catastrophically (+0.58 to +0.68 in every cell, both regimes), because a per-treatment funnel regression on three-to-six studies has enormous intercept variance — even in Regime B where it is correctly specified. Trim-and-fill and Henmi–Copas are inert-to-harmful, with one honest exception: Henmi–Copas posts a negligible formal win (ΔMCIW0 −0.008 [−0.023, −0.001]) in the single most extreme cell (B = 0.30, Regime B) — within Monte-Carlo noise and an order of magnitude below the registry margin there — so it is not a deployable alternative, but 'no internal model ever wins' would be strictly over-broad. Copas–Shi is infeasible on the network. The registry λ is an external, near-zero-sampling-variance direction-of-selection signal the internal methods cannot recover from a handful of studies.</w:t>
       </w:r>
     </w:p>
     <w:p>
@@ -5983,7 +5983,7 @@
         <w:t xml:space="preserve">Independent cross-vendor witness. </w:t>
       </w:r>
       <w:r>
-        <w:t xml:space="preserve">An external vendor (Codex, GPT-5.5), given only the per-analysis records, the senn2013 dataset, and a written specification — and instructed to import none of our code — implemented its own aggregation, its own random-effects NMA, and its own bootstrap. It reproduced the engine-free claims to four decimal places (κ_pooled 0.15759 vs 0.1576; corr +0.50142 vs +0.501; identical per-class κ_MD and class set) and, on its own NMA engine, reproduced the truth-gate relationship exactly: the frozen external κ tracks the oracle at B = 0.15 (its ΔMCIW0 −0.1020 vs oracle −0.1018, within 0.0002; both win), over-corrects at B = 0 (+0.055), and under-corrects at B = 0.30 — verdict "CONFIRMS". Absolute ΔMCIW0 levels differ slightly from ours (−0.102 vs −0.119 at B = 0.15) only because of the independent NMA implementation and RNG; the conclusion is identical.</w:t>
+        <w:t xml:space="preserve">An external vendor (Codex, GPT-5.5), given only the per-analysis records, the senn2013 dataset, and a written specification — and instructed to import none of our code — implemented its own aggregation, its own random-effects NMA, and its own bootstrap. It reproduced the engine-free claims to four decimal places (κ_pooled 0.15759 vs 0.1576; corr +0.50142 vs +0.501; identical per-class κ_MD and class set) and, on its own NMA engine, reproduced the truth-gate relationship exactly: the frozen external κ tracks the oracle at B = 0.15 (its ΔMCIW0 −0.1020 vs oracle −0.1018, within 0.0002; both win), over-corrects at B = 0 (+0.055), and under-corrects at B = 0.30 — verdict "CONFIRMS". Absolute ΔMCIW0 levels differ slightly from ours (−0.102 vs −0.119 at B = 0.15) only because of the independent NMA implementation and RNG; the conclusion is identical. The cross-vendor check also surfaced the honest single-cell Henmi–Copas exception noted in §3.3, which we have hedged accordingly.</w:t>
       </w:r>
     </w:p>
     <w:p>
@@ -8813,7 +8813,7 @@
         <w:spacing w:after="120" w:line="276"/>
       </w:pPr>
       <w:r>
-        <w:t xml:space="preserve">For networks too sparse for internal funnel methods, a trial registry supplies both the direction and — via the registered-versus-published effect gap — a calibrated magnitude for publication-bias correction. The external magnitude matches an oracle at realistic selection levels and beats every internal selection model, while the one residual (distinguishing an unbiased estimate within a selection-prone class) is shown to be irreducible on a sparse network rather than a defect of the method.</w:t>
+        <w:t xml:space="preserve">For networks too sparse for internal funnel methods, a trial registry supplies both the direction and — via the registered-versus-published effect gap — a calibrated magnitude for publication-bias correction. The external magnitude matches an oracle at realistic selection levels and beats every internal selection model (bar a single negligible −0.008 Henmi–Copas formal win in the most extreme selection cell), while the one residual (distinguishing an unbiased estimate within a selection-prone class) is shown to be irreducible on a sparse network rather than a defect of the method.</w:t>
       </w:r>
     </w:p>
     <w:p>

</xml_diff>

<commit_message>
manuscript: fold scrambled-lambda falsification into validation section 3.4
Honest decomposition added: generic-shrinkage floor (all scrambles win) + significant registry-ordering
component (perm-p 0.025->0.000, gain grows with selection). Registry signal carries real per-class info
beyond generic shrinkage; not claimed as sole driver. docx rebuilt+validated.

Co-Authored-By: Claude Opus 4.8 (1M context) <noreply@anthropic.com>
</commit_message>
<xml_diff>
--- a/manuscript/Transport_NMA.docx
+++ b/manuscript/Transport_NMA.docx
@@ -5984,6 +5984,21 @@
       </w:r>
       <w:r>
         <w:t xml:space="preserve">An external vendor (Codex, GPT-5.5), given only the per-analysis records, the senn2013 dataset, and a written specification — and instructed to import none of our code — implemented its own aggregation, its own random-effects NMA, and its own bootstrap. It reproduced the engine-free claims to four decimal places (κ_pooled 0.15759 vs 0.1576; corr +0.50142 vs +0.501; identical per-class κ_MD and class set) and, on its own NMA engine, reproduced the truth-gate relationship exactly: the frozen external κ tracks the oracle at B = 0.15 (its ΔMCIW0 −0.1020 vs oracle −0.1018, within 0.0002; both win), over-corrects at B = 0 (+0.055), and under-corrects at B = 0.30 — verdict "CONFIRMS". Absolute ΔMCIW0 levels differ slightly from ours (−0.102 vs −0.119 at B = 0.15) only because of the independent NMA implementation and RNG; the conclusion is identical. The cross-vendor check also surfaced the honest single-cell Henmi–Copas exception noted in §3.3, which we have hedged accordingly.</w:t>
+      </w:r>
+    </w:p>
+    <w:p>
+      <w:pPr>
+        <w:spacing w:after="120" w:line="276"/>
+      </w:pPr>
+      <w:r>
+        <w:rPr>
+          <w:b/>
+          <w:bCs/>
+        </w:rPr>
+        <w:t xml:space="preserve">Falsification — registry ordering or just shrinkage? </w:t>
+      </w:r>
+      <w:r>
+        <w:t xml:space="preserve">Permuting the λ values across treatments in the correction (bias still injected with the true λ) decomposes the gain honestly. Every scrambled permutation still wins (under selection any null-ward shrinkage helps — a generic-shrinkage floor), but the true λ ordering beats the scrambled distribution (permutation p = 0.025 at B = 0.15, 0.000 at B = 0.30) and its advantage grows with selection strength (ordering gain +0.033 → +0.091). So the registry ordering carries genuine, statistically significant per-class information beyond generic shrinkage — while we do not claim it is the sole driver.</w:t>
       </w:r>
     </w:p>
     <w:p>

</xml_diff>

<commit_message>
manuscript+report: hedge the primary corr(+0.50) as suggestive-not-significant (n=7, perm-p 0.15)
Truth-first correction of a mild over-claim: the diabetes 7-class corr is descriptive/suggestive, not
significant on its own (perm-p 0.15, bootstrap CI [-0.92,+0.96]). Reframed abstract + sec 3.2 + REPORT so
the model's oracle-free support rests on (i) trial-level per-class gaps (CIs exclude 0) and (ii) the
scrambled-lambda falsification (perm-p 0.025->0.000, powered), with the 7-point correlation as a descriptive
summary not the inferential basis. docx rebuilt+validated.

Co-Authored-By: Claude Opus 4.8 (1M context) <noreply@anthropic.com>
</commit_message>
<xml_diff>
--- a/manuscript/Transport_NMA.docx
+++ b/manuscript/Transport_NMA.docx
@@ -201,7 +201,7 @@
         <w:t xml:space="preserve">Results. </w:t>
       </w:r>
       <w:r>
-        <w:t xml:space="preserve">The external registry correction (oracle magnitude) is the only method that reliably improves matched-coverage error under selection (ΔMCIW0 −0.118 at B=0.15, −0.306 at B=0.30) and is exactly inert at B=0; every internal funnel model fails — PET-PEESE over-corrects catastrophically (up to +0.68 every cell). The registered-versus-published gap validates the registry model with no oracle: the per-class effect gap rises with selection severity (Pearson r = 0.50 vs 1−λ). The frozen pooled external magnitude κ = 0.158 matches the oracle at B=0.15 (ΔMCIW0 −0.119 vs −0.118) and wins across all B ≥ 0.15 in both funnel regimes — converting the correction from direction-only to direction + calibrated magnitude.</w:t>
+        <w:t xml:space="preserve">The external registry correction (oracle magnitude) is the only method that reliably improves matched-coverage error under selection (ΔMCIW0 −0.118 at B=0.15, −0.306 at B=0.30) and is exactly inert at B=0; every internal funnel model fails — PET-PEESE over-corrects catastrophically (up to +0.68 every cell). The registered-versus-published gap supports the registry model with no oracle: the per-class effect gap rises with selection severity (Pearson r = 0.50 vs 1−λ — descriptively supportive but, at 7 classes, not significant alone: permutation p = 0.15; the robust support is the trial-level per-class gaps and the scrambled-λ falsification). The frozen pooled external magnitude κ = 0.158 matches the oracle at B=0.15 (ΔMCIW0 −0.119 vs −0.118) and wins across all B ≥ 0.15 in both funnel regimes — converting the correction from direction-only to direction + calibrated magnitude.</w:t>
       </w:r>
     </w:p>
     <w:p>
@@ -2736,7 +2736,7 @@
         <w:spacing w:after="120" w:line="276"/>
       </w:pPr>
       <w:r>
-        <w:t xml:space="preserve">Across 464 HbA1c mean-difference analyses, published trials report a larger absolute HbA1c effect than registered-only trials in the well-supported classes: metformin +0.08, SGLT2 +0.29, DPP-4 +0.21, α-glucosidase +0.35 (Table 2). Critically, the gap grows with registry selection severity: κ_MD(c) correlates with (1 − λc) at Pearson r = 0.50, and its through-origin regression slope is 0.26 (Figure 1). This is an external, oracle-free confirmation that the registry λ ranks selection severity in the same direction as the actual published-effect inflation — the assumption the correction rests on, now supported by independent data. The frozen scales are κ_pooled = 0.158 and κ_slope = 0.263. Small-n classes are excluded (e.g. sulfonylurea has only 3 registered-only analyses, producing an implausible −0.64 driven by one large value).</w:t>
+        <w:t xml:space="preserve">Across 464 HbA1c mean-difference analyses, published trials report a larger absolute HbA1c effect than registered-only trials in the well-supported classes: metformin +0.08, SGLT2 +0.29, DPP-4 +0.21, α-glucosidase +0.35 (Table 2). Descriptively, the gap grows with registry selection severity: κ_MD(c) correlates with (1 − λc) at Pearson r = 0.50, through-origin slope 0.26 (Figure 1). We flag the caveat directly: over 7 classes this class-level correlation is suggestive, not significant (permutation p = 0.15; bootstrap 95% CI [−0.92, +0.96]). The oracle-free support that registry λ ranks selection severity in the same direction as the published-effect inflation rests on the trial-level per-class gaps (CIs excluding 0 in the well-powered classes) and, decisively, on the scrambled-λ falsification (§3.4, permutation p 0.025 → 0.000, powered over replicates × treatments); the 7-class correlation is a descriptive summary, not the inferential basis. The frozen scales are κ_pooled = 0.158 and κ_slope = 0.263. Small-n classes are excluded (e.g. sulfonylurea has only 3 registered-only analyses, producing an implausible −0.64 driven by one large value).</w:t>
       </w:r>
     </w:p>
     <w:p>

</xml_diff>

<commit_message>
transport-nma: CORRECT a second over-claim -- only SGLT2's diabetes gap is individually significant
The hedge itself over-claimed 'trial-level CIs exclude 0 for metformin/SGLT2/DPP4'. Verified per-class
bootstrap: within diabetes ONLY SGLT2 excludes 0 (+0.289[+0.02,+0.65]); DPP4 +0.21 barely includes 0
[-0.008,+0.48], metformin/GLP1/insulin/TZD/AGI include 0. Corrected manuscript(abstract+3.2)+REPORT: the
oracle-free support is (i) the scrambled-lambda falsification (powered) and (ii) the individually-significant
gaps in the OTHER domains (antidep SSRI/atypical, lipid statin/ezetimibe); within diabetes only SGLT2.
Regression test now guards SGLT2 (the truly-robust class). Caught by the test -- truth-first iteration.

Co-Authored-By: Claude Opus 4.8 (1M context) <noreply@anthropic.com>
</commit_message>
<xml_diff>
--- a/manuscript/Transport_NMA.docx
+++ b/manuscript/Transport_NMA.docx
@@ -201,7 +201,7 @@
         <w:t xml:space="preserve">Results. </w:t>
       </w:r>
       <w:r>
-        <w:t xml:space="preserve">The external registry correction (oracle magnitude) is the only method that reliably improves matched-coverage error under selection (ΔMCIW0 −0.118 at B=0.15, −0.306 at B=0.30) and is exactly inert at B=0; every internal funnel model fails — PET-PEESE over-corrects catastrophically (up to +0.68 every cell). The registered-versus-published gap supports the registry model with no oracle: the per-class effect gap rises with selection severity (Pearson r = 0.50 vs 1−λ — descriptively supportive but, at 7 classes, not significant alone: permutation p = 0.15; the robust support is the trial-level per-class gaps and the scrambled-λ falsification). The frozen pooled external magnitude κ = 0.158 matches the oracle at B=0.15 (ΔMCIW0 −0.119 vs −0.118) and wins across all B ≥ 0.15 in both funnel regimes — converting the correction from direction-only to direction + calibrated magnitude.</w:t>
+        <w:t xml:space="preserve">The external registry correction (oracle magnitude) is the only method that reliably improves matched-coverage error under selection (ΔMCIW0 −0.118 at B=0.15, −0.306 at B=0.30) and is exactly inert at B=0; every internal funnel model fails — PET-PEESE over-corrects catastrophically (up to +0.68 every cell). The registered-versus-published gap supports the registry model with no oracle: the per-class effect gap rises with selection severity (Pearson r = 0.50 vs 1−λ — descriptively supportive but, at 7 classes, not significant alone: permutation p = 0.15; the robust support is the scrambled-λ falsification and the individually-significant cross-domain gaps, within diabetes only SGLT2's). The frozen pooled external magnitude κ = 0.158 matches the oracle at B=0.15 (ΔMCIW0 −0.119 vs −0.118) and wins across all B ≥ 0.15 in both funnel regimes — converting the correction from direction-only to direction + calibrated magnitude.</w:t>
       </w:r>
     </w:p>
     <w:p>
@@ -2736,7 +2736,7 @@
         <w:spacing w:after="120" w:line="276"/>
       </w:pPr>
       <w:r>
-        <w:t xml:space="preserve">Across 464 HbA1c mean-difference analyses, published trials report a larger absolute HbA1c effect than registered-only trials in the well-supported classes: metformin +0.08, SGLT2 +0.29, DPP-4 +0.21, α-glucosidase +0.35 (Table 2). Descriptively, the gap grows with registry selection severity: κ_MD(c) correlates with (1 − λc) at Pearson r = 0.50, through-origin slope 0.26 (Figure 1). We flag the caveat directly: over 7 classes this class-level correlation is suggestive, not significant (permutation p = 0.15; bootstrap 95% CI [−0.92, +0.96]). The oracle-free support that registry λ ranks selection severity in the same direction as the published-effect inflation rests on the trial-level per-class gaps (CIs excluding 0 in the well-powered classes) and, decisively, on the scrambled-λ falsification (§3.4, permutation p 0.025 → 0.000, powered over replicates × treatments); the 7-class correlation is a descriptive summary, not the inferential basis. The frozen scales are κ_pooled = 0.158 and κ_slope = 0.263. Small-n classes are excluded (e.g. sulfonylurea has only 3 registered-only analyses, producing an implausible −0.64 driven by one large value).</w:t>
+        <w:t xml:space="preserve">Across 464 HbA1c mean-difference analyses, published trials report a larger absolute HbA1c effect than registered-only trials in the well-supported classes: metformin +0.08, SGLT2 +0.29, DPP-4 +0.21, α-glucosidase +0.35 (Table 2). Descriptively, the gap grows with registry selection severity: κ_MD(c) correlates with (1 − λc) at Pearson r = 0.50, through-origin slope 0.26 (Figure 1). We flag the caveat directly: over 7 classes this class-level correlation is suggestive, not significant (permutation p = 0.15; bootstrap 95% CI [−0.92, +0.96]). The oracle-free support rests, decisively, on the scrambled-λ falsification (§3.4, permutation p 0.025 → 0.000, powered over replicates × treatments) and on the individually-significant trial-level gaps in the other domains (antidepressant SSRI +0.69 [+0.23, +1.29], atypical +1.18 [+0.73, +1.86]; lipid statin +0.50 [+0.23, +0.85], ezetimibe +0.45 [+0.20, +0.75]); within diabetes only SGLT2's individual gap CI excludes 0 ([+0.02, +0.65]). The 7-class correlation is a descriptive summary, not the inferential basis. The frozen scales are κ_pooled = 0.158 and κ_slope = 0.263. Small-n classes are excluded (e.g. sulfonylurea has only 3 registered-only analyses, producing an implausible −0.64 driven by one large value).</w:t>
       </w:r>
     </w:p>
     <w:p>

</xml_diff>

<commit_message>
transport-nma manuscript: final consistency pass -- align residual 'validates'/'established' with the significance hedge
Scan found 3 residual over-claims inconsistent with the corr-significance correction: sec 3.2 heading
'validates'->'supports'; Discussion 'both validates the severity ordering'->'supports...(descriptive r=0.50,
significance from falsification+cross-domain gaps)'; replication para 'correlation is established in diabetes'
->'descriptively present but not individually significant (perm-p 0.15)'. Also verified the scrambled-lambda
falsification perm-p is seed-STABLE at 0.017 across 3 seeds (the claim the paper now leans on is robust).
docx rebuilt+validated, no leaks. Manuscript now internally consistent + truth-first throughout.

Co-Authored-By: Claude Opus 4.8 (1M context) <noreply@anthropic.com>
</commit_message>
<xml_diff>
--- a/manuscript/Transport_NMA.docx
+++ b/manuscript/Transport_NMA.docx
@@ -2728,7 +2728,7 @@
         <w:pStyle w:val="Heading2"/>
       </w:pPr>
       <w:r>
-        <w:t xml:space="preserve">3.2 The registered-versus-published gap validates the registry model — with no oracle</w:t>
+        <w:t xml:space="preserve">3.2 The registered-versus-published gap supports the registry model — with no oracle</w:t>
       </w:r>
     </w:p>
     <w:p>
@@ -8722,7 +8722,7 @@
         <w:t xml:space="preserve">What is new. </w:t>
       </w:r>
       <w:r>
-        <w:t xml:space="preserve">Publication-bias correction in NMA has lacked a usable magnitude: the internal funnel is too noisy on a few studies per contrast (confirmed here by PET-PEESE's catastrophic failure and by a companion internal-κ̂ experiment that also failed). This paper supplies the magnitude from outside the network, using the registry's own record of which trials were published. The registered-versus-published effect gap both validates the severity ordering (no oracle; r = 0.50) and calibrates the strength (κ_pooled matches the oracle at plausible selection levels).</w:t>
+        <w:t xml:space="preserve">Publication-bias correction in NMA has lacked a usable magnitude: the internal funnel is too noisy on a few studies per contrast (confirmed here by PET-PEESE's catastrophic failure and by a companion internal-κ̂ experiment that also failed). This paper supplies the magnitude from outside the network, using the registry's own record of which trials were published. The registered-versus-published effect gap supports the severity ordering (no oracle; descriptively r = 0.50, significance carried by the scrambled-λ falsification and cross-domain gaps not the 7-class correlation) and calibrates the strength (κ_pooled matches the oracle at plausible selection levels).</w:t>
       </w:r>
     </w:p>
     <w:p>
@@ -8797,7 +8797,7 @@
         <w:t xml:space="preserve">Second-domain replication (antidepressants). </w:t>
       </w:r>
       <w:r>
-        <w:t xml:space="preserve">We tested endpoint-generalisation directly in Turner's own domain (major depression). Raw AACT HAM-D mean differences do not transfer — but this is a scale artefact, not a real boundary: raw HAM-D mixes 17/21/24-item versions, within- vs between-arm, and timepoints (41% have |MD| &lt; 0.5, implausible), so the ratio reflects scale heterogeneity. Re-run on scale-invariant measures the gap reproduces. On the standardised significance measure z = |MD|/SE (HAM-D + MADRS), corr(κ_z, 1−λ) = +0.64 over the three adequately-powered classes (diabetes reference +0.50), and trial-level bootstrap shows published trials have robustly larger standardised effects in the two best-powered classes (SSRI κ_z +0.69 [+0.23, +1.29]; atypical +1.18 [+0.73, +1.86]; both exclude 0), while the lowest-severity class SNRI is null (−0.33 [−0.55, +0.26]) — consistent with the severity-tracking model. On response/remission log-odds the SSRI gap is also robustly positive (+0.47 [+0.09, +1.14]). We do not over-claim: only 2–3 antidepressant classes carry adequate registered-only support, so the class-level correlation is suggestive, not inferential; the robust evidence is the per-class trial-level gaps. A third domain — lipid-lowering therapy (LDL-C) — reproduces the trial-level inflation robustly (statin z-gap +1.23 [+0.81, +1.75], ezetimibe +1.33 [+0.88, +1.89]; percent-change |MD| +0.50 and +0.45, all CIs exclude 0), but its severity-correlation is not testable because lipid trials are publication-saturated (only 2 classes clear the registered-only threshold; PCSK9 268 published vs 6 registered-only, fibrate/bile-acid/niacin none). Across three domains the 'published effects are inflated' signal reproduces robustly; the 'gap grows with selection severity' correlation is established in diabetes (7 classes), suggestive in antidepressants (3 classes), and not testable in publication-saturated lipids. A fourth domain we tested — antihypertensive therapy (systolic BP) — does NOT reproduce: per-class gaps are mostly null-to-negative (ARB −0.13, diuretic −0.27) and the 3-class correlation is uninformative (CI spanning [−1, +1]). We report this plainly and do not over-diagnose it (a placebo-comparator check did not separate BP from diabetes); the honest conclusion is that the registered-versus-published gap is a real but domain-dependent phenomenon — demonstrated in diabetes/antidepressants/lipids, absent in antihypertensive SBP on this snapshot. Diabetes remains the primary validation.</w:t>
+        <w:t xml:space="preserve">We tested endpoint-generalisation directly in Turner's own domain (major depression). Raw AACT HAM-D mean differences do not transfer — but this is a scale artefact, not a real boundary: raw HAM-D mixes 17/21/24-item versions, within- vs between-arm, and timepoints (41% have |MD| &lt; 0.5, implausible), so the ratio reflects scale heterogeneity. Re-run on scale-invariant measures the gap reproduces. On the standardised significance measure z = |MD|/SE (HAM-D + MADRS), corr(κ_z, 1−λ) = +0.64 over the three adequately-powered classes (diabetes reference +0.50), and trial-level bootstrap shows published trials have robustly larger standardised effects in the two best-powered classes (SSRI κ_z +0.69 [+0.23, +1.29]; atypical +1.18 [+0.73, +1.86]; both exclude 0), while the lowest-severity class SNRI is null (−0.33 [−0.55, +0.26]) — consistent with the severity-tracking model. On response/remission log-odds the SSRI gap is also robustly positive (+0.47 [+0.09, +1.14]). We do not over-claim: only 2–3 antidepressant classes carry adequate registered-only support, so the class-level correlation is suggestive, not inferential; the robust evidence is the per-class trial-level gaps. A third domain — lipid-lowering therapy (LDL-C) — reproduces the trial-level inflation robustly (statin z-gap +1.23 [+0.81, +1.75], ezetimibe +1.33 [+0.88, +1.89]; percent-change |MD| +0.50 and +0.45, all CIs exclude 0), but its severity-correlation is not testable because lipid trials are publication-saturated (only 2 classes clear the registered-only threshold; PCSK9 268 published vs 6 registered-only, fibrate/bile-acid/niacin none). Across three domains the 'published effects are inflated' signal reproduces robustly; the 'gap grows with selection severity' correlation is descriptively present but not individually significant in diabetes (7 classes, permutation p = 0.15), likewise suggestive in antidepressants (3 classes), and not testable in publication-saturated lipids — significance for that severity claim comes from the scrambled-λ falsification, not the small class-level correlations. A fourth domain we tested — antihypertensive therapy (systolic BP) — does NOT reproduce: per-class gaps are mostly null-to-negative (ARB −0.13, diuretic −0.27) and the 3-class correlation is uninformative (CI spanning [−1, +1]). We report this plainly and do not over-diagnose it (a placebo-comparator check did not separate BP from diabetes); the honest conclusion is that the registered-versus-published gap is a real but domain-dependent phenomenon — demonstrated in diabetes/antidepressants/lipids, absent in antihypertensive SBP on this snapshot. Diabetes remains the primary validation.</w:t>
       </w:r>
     </w:p>
     <w:p>

</xml_diff>